<commit_message>
adding to git 6th practics
</commit_message>
<xml_diff>
--- a/steganography/docs/reports/2025/6/ПР6.docx
+++ b/steganography/docs/reports/2025/6/ПР6.docx
@@ -226,7 +226,7 @@
           <w:rFonts w:ascii="Times New Roman" w:hAnsi="Times New Roman"/>
           <w:b/>
         </w:rPr>
-        <w:t>На тему «LSB-стеганография в BMP с шифрованием Виженера»</w:t>
+        <w:t>«LSB-стеганография в BMP с шифрованием Виженера (реализация в Mathcad Prime)»</w:t>
       </w:r>
     </w:p>
     <w:p>
@@ -328,820 +328,246 @@
     </w:p>
     <w:p>
       <w:pPr>
-        <w:spacing w:before="240" w:after="120"/>
+        <w:keepNext/>
+        <w:spacing w:before="240" w:after="120" w:line="240" w:lineRule="auto"/>
         <w:ind w:firstLine="0"/>
-        <w:jc w:val="center"/>
+        <w:jc w:val="left"/>
       </w:pPr>
       <w:r>
         <w:rPr>
           <w:rFonts w:ascii="Times New Roman" w:hAnsi="Times New Roman"/>
           <w:b/>
-          <w:sz w:val="32"/>
+          <w:i w:val="0"/>
+          <w:sz w:val="30"/>
         </w:rPr>
         <w:t>1. Цель работы</w:t>
       </w:r>
     </w:p>
     <w:p>
       <w:pPr>
+        <w:spacing w:after="80" w:line="360" w:lineRule="auto"/>
+        <w:ind w:firstLine="709"/>
         <w:jc w:val="both"/>
       </w:pPr>
       <w:r>
         <w:rPr>
           <w:rFonts w:ascii="Times New Roman" w:hAnsi="Times New Roman"/>
+          <w:b w:val="0"/>
+          <w:i w:val="0"/>
           <w:sz w:val="28"/>
         </w:rPr>
-        <w:t>Познакомиться с методом замены наименее значащего бита (LSB) для сокрытия информации в неподвижных изображениях. Реализовать программу встраивания текстового сообщения в 24-битный BMP-контейнер с предварительным криптографическим кодированием (модифицированный шифр Виженера) и обёрткой полезной нагрузки управляющими метками начала/конца.</w:t>
+        <w:t>Познакомиться с одним из наиболее распространённых методов сокрытия информации в неподвижных изображениях — методом замены наименее значащего бита (НЗБ, LSB). Реализовать в математическом пакете Mathcad Prime пошаговое встраивание текстового сообщения в 24-битный BMP-контейнер с предварительной криптографической защитой (модифицированный шифр Виженера) и обрамлением полезной нагрузки управляющими метками начала и конца, а также обратную операцию — извлечение и расшифровку скрытого сообщения.</w:t>
       </w:r>
     </w:p>
     <w:p>
       <w:pPr>
-        <w:spacing w:before="240" w:after="120"/>
+        <w:keepNext/>
+        <w:spacing w:before="240" w:after="120" w:line="240" w:lineRule="auto"/>
         <w:ind w:firstLine="0"/>
-        <w:jc w:val="center"/>
+        <w:jc w:val="left"/>
       </w:pPr>
       <w:r>
         <w:rPr>
           <w:rFonts w:ascii="Times New Roman" w:hAnsi="Times New Roman"/>
           <w:b/>
-          <w:sz w:val="32"/>
+          <w:i w:val="0"/>
+          <w:sz w:val="30"/>
         </w:rPr>
         <w:t>2. Теоретическая часть</w:t>
       </w:r>
     </w:p>
     <w:p>
       <w:pPr>
+        <w:spacing w:after="80" w:line="360" w:lineRule="auto"/>
+        <w:ind w:firstLine="709"/>
         <w:jc w:val="both"/>
       </w:pPr>
       <w:r>
         <w:rPr>
           <w:rFonts w:ascii="Times New Roman" w:hAnsi="Times New Roman"/>
+          <w:b w:val="0"/>
+          <w:i w:val="0"/>
           <w:sz w:val="28"/>
         </w:rPr>
-        <w:t>В методе LSB младший бит каждого канала пикселя (R, G, B) несёт один бит секретного сообщения. Поскольку для 8-битного канала изменение младшего бита визуально незаметно, контейнер сохраняет внешний вид при ёмкости до 3 бит на пиксель. Для защиты содержимого сообщение предварительно шифруется потоковым шифром Виженера mod 256, а для надёжного выделения полезной нагрузки в потоке LSB-битов используются метки начала и конца.</w:t>
+        <w:t>Метод замены наименее значащего бита (НЗБ, LSB — Least Significant Bit) наиболее распространён среди методов замены в пространственной области. Младший значащий бит изображения несёт в себе меньше всего информации: человек в большинстве случаев не способен заметить его изменение. Фактически НЗБ — это шум, поэтому его можно использовать для встраивания секретного сообщения, заменяя младшие биты пикселей битами сообщения.</w:t>
       </w:r>
     </w:p>
     <w:p>
       <w:pPr>
-        <w:spacing w:before="240" w:after="120"/>
+        <w:spacing w:after="80" w:line="360" w:lineRule="auto"/>
+        <w:ind w:firstLine="709"/>
+        <w:jc w:val="both"/>
+      </w:pPr>
+      <w:r>
+        <w:rPr>
+          <w:rFonts w:ascii="Times New Roman" w:hAnsi="Times New Roman"/>
+          <w:b w:val="0"/>
+          <w:i w:val="0"/>
+          <w:sz w:val="28"/>
+        </w:rPr>
+        <w:t>Для изображения в градациях серого (1 байт на пиксель) объём встраиваемых данных может составлять до 1/8 от объёма контейнера. Для 24-битного цветного изображения каждый пиксель хранит три компоненты (R, G, B), поэтому в него можно встроить до 3 бит на пиксель. Метод работает с растровыми изображениями в форматах без компрессии (например, BMP).</w:t>
+      </w:r>
+    </w:p>
+    <w:p>
+      <w:pPr>
+        <w:spacing w:after="80" w:line="360" w:lineRule="auto"/>
+        <w:ind w:firstLine="709"/>
+        <w:jc w:val="both"/>
+      </w:pPr>
+      <w:r>
+        <w:rPr>
+          <w:rFonts w:ascii="Times New Roman" w:hAnsi="Times New Roman"/>
+          <w:b w:val="0"/>
+          <w:i w:val="0"/>
+          <w:sz w:val="28"/>
+        </w:rPr>
+        <w:t>Основной недостаток метода — низкая стойкость к искажениям контейнера и к стегоанализу. Для повышения защищённости содержимое предварительно шифруется (в данной работе — модифицированным шифром Виженера по модулю 256), а для надёжного выделения полезной нагрузки в потоке НЗБ-битов применяются секретные метки начала и конца.</w:t>
+      </w:r>
+    </w:p>
+    <w:p>
+      <w:pPr>
+        <w:keepNext/>
+        <w:spacing w:before="240" w:after="120" w:line="240" w:lineRule="auto"/>
         <w:ind w:firstLine="0"/>
-        <w:jc w:val="center"/>
+        <w:jc w:val="left"/>
       </w:pPr>
       <w:r>
         <w:rPr>
           <w:rFonts w:ascii="Times New Roman" w:hAnsi="Times New Roman"/>
           <w:b/>
-          <w:sz w:val="32"/>
+          <w:i w:val="0"/>
+          <w:sz w:val="30"/>
         </w:rPr>
-        <w:t>3. Задание на выполнение</w:t>
+        <w:t>3. Задание на лабораторную работу</w:t>
       </w:r>
     </w:p>
     <w:p>
       <w:pPr>
-        <w:ind w:firstLine="0"/>
-        <w:jc w:val="both"/>
+        <w:spacing w:after="80" w:line="360" w:lineRule="auto"/>
+        <w:ind w:firstLine="709"/>
+        <w:jc w:val="left"/>
       </w:pPr>
       <w:r>
         <w:rPr>
           <w:rFonts w:ascii="Times New Roman" w:hAnsi="Times New Roman"/>
+          <w:b w:val="0"/>
+          <w:i w:val="0"/>
           <w:sz w:val="28"/>
         </w:rPr>
-        <w:t>— реализовать чтение BMP-файла и доступ к каналам RGB его пикселей;</w:t>
+        <w:t>Разработать в программе Mathcad Prime реализацию метода замены наименее значащего бита в соответствии с шагами, описанными в методических указаниях. Порядок работы:</w:t>
       </w:r>
     </w:p>
     <w:p>
       <w:pPr>
-        <w:ind w:firstLine="0"/>
+        <w:spacing w:after="40" w:line="360" w:lineRule="auto"/>
+        <w:ind w:left="567" w:firstLine="0"/>
         <w:jc w:val="both"/>
       </w:pPr>
       <w:r>
         <w:rPr>
           <w:rFonts w:ascii="Times New Roman" w:hAnsi="Times New Roman"/>
+          <w:b w:val="0"/>
+          <w:i w:val="0"/>
           <w:sz w:val="28"/>
         </w:rPr>
-        <w:t>— реализовать модифицированный шифр Виженера (mod 256) для байтового потока;</w:t>
+        <w:t>— импортировать контейнер (BMP) и разложить его на цветовые каналы R, G, B;</w:t>
       </w:r>
     </w:p>
     <w:p>
       <w:pPr>
-        <w:ind w:firstLine="0"/>
+        <w:spacing w:after="40" w:line="360" w:lineRule="auto"/>
+        <w:ind w:left="567" w:firstLine="0"/>
         <w:jc w:val="both"/>
       </w:pPr>
       <w:r>
         <w:rPr>
           <w:rFonts w:ascii="Times New Roman" w:hAnsi="Times New Roman"/>
+          <w:b w:val="0"/>
+          <w:i w:val="0"/>
           <w:sz w:val="28"/>
         </w:rPr>
-        <w:t>— обернуть шифротекст метками начала и конца, как в методичке;</w:t>
+        <w:t>— импортировать текстовое сообщение как последовательность байтов;</w:t>
       </w:r>
     </w:p>
     <w:p>
       <w:pPr>
-        <w:ind w:firstLine="0"/>
+        <w:spacing w:after="40" w:line="360" w:lineRule="auto"/>
+        <w:ind w:left="567" w:firstLine="0"/>
         <w:jc w:val="both"/>
       </w:pPr>
       <w:r>
         <w:rPr>
           <w:rFonts w:ascii="Times New Roman" w:hAnsi="Times New Roman"/>
+          <w:b w:val="0"/>
+          <w:i w:val="0"/>
           <w:sz w:val="28"/>
         </w:rPr>
-        <w:t>— встроить байты в младшие биты каналов изображения и сохранить новый BMP;</w:t>
+        <w:t>— зашифровать сообщение модифицированным шифром Виженера (mod 256);</w:t>
       </w:r>
     </w:p>
     <w:p>
       <w:pPr>
-        <w:ind w:firstLine="0"/>
+        <w:spacing w:after="40" w:line="360" w:lineRule="auto"/>
+        <w:ind w:left="567" w:firstLine="0"/>
         <w:jc w:val="both"/>
       </w:pPr>
       <w:r>
         <w:rPr>
           <w:rFonts w:ascii="Times New Roman" w:hAnsi="Times New Roman"/>
+          <w:b w:val="0"/>
+          <w:i w:val="0"/>
           <w:sz w:val="28"/>
         </w:rPr>
-        <w:t>— реализовать обратную операцию извлечения и расшифровки сообщения.</w:t>
+        <w:t>— обрамить шифротекст метками начала и конца;</w:t>
       </w:r>
     </w:p>
     <w:p>
       <w:pPr>
-        <w:spacing w:before="240" w:after="120"/>
+        <w:spacing w:after="40" w:line="360" w:lineRule="auto"/>
+        <w:ind w:left="567" w:firstLine="0"/>
+        <w:jc w:val="both"/>
+      </w:pPr>
+      <w:r>
+        <w:rPr>
+          <w:rFonts w:ascii="Times New Roman" w:hAnsi="Times New Roman"/>
+          <w:b w:val="0"/>
+          <w:i w:val="0"/>
+          <w:sz w:val="28"/>
+        </w:rPr>
+        <w:t>— встроить биты в младшие разряды каналов и записать новый BMP-файл;</w:t>
+      </w:r>
+    </w:p>
+    <w:p>
+      <w:pPr>
+        <w:spacing w:after="40" w:line="360" w:lineRule="auto"/>
+        <w:ind w:left="567" w:firstLine="0"/>
+        <w:jc w:val="both"/>
+      </w:pPr>
+      <w:r>
+        <w:rPr>
+          <w:rFonts w:ascii="Times New Roman" w:hAnsi="Times New Roman"/>
+          <w:b w:val="0"/>
+          <w:i w:val="0"/>
+          <w:sz w:val="28"/>
+        </w:rPr>
+        <w:t>— реализовать обратную операцию — извлечение и расшифровку сообщения.</w:t>
+      </w:r>
+    </w:p>
+    <w:p>
+      <w:pPr>
+        <w:keepNext/>
+        <w:spacing w:before="240" w:after="120" w:line="240" w:lineRule="auto"/>
         <w:ind w:firstLine="0"/>
-        <w:jc w:val="center"/>
+        <w:jc w:val="left"/>
       </w:pPr>
       <w:r>
         <w:rPr>
           <w:rFonts w:ascii="Times New Roman" w:hAnsi="Times New Roman"/>
           <w:b/>
-          <w:sz w:val="32"/>
+          <w:i w:val="0"/>
+          <w:sz w:val="30"/>
         </w:rPr>
-        <w:t>4. Архитектура решения (Clean Architecture)</w:t>
-      </w:r>
-    </w:p>
-    <w:p>
-      <w:pPr>
-        <w:jc w:val="both"/>
-      </w:pPr>
-      <w:r>
-        <w:rPr>
-          <w:rFonts w:ascii="Times New Roman" w:hAnsi="Times New Roman"/>
-          <w:sz w:val="28"/>
-        </w:rPr>
-        <w:t>Программа разделена на слои domain / application / infrastructure / presentation. BMP-инфраструктура вынесена в domain/common/bmp + infrastructure/bmp и переиспользуется ПР7.</w:t>
-      </w:r>
-    </w:p>
-    <w:p>
-      <w:pPr>
-        <w:ind w:firstLine="0"/>
-        <w:jc w:val="both"/>
-      </w:pPr>
-      <w:r>
-        <w:rPr>
-          <w:rFonts w:ascii="Times New Roman" w:hAnsi="Times New Roman"/>
-          <w:sz w:val="28"/>
-        </w:rPr>
-        <w:t>• domain/common/bmp/ — общие VO Pixel/BmpImage и Protocol-порты BmpReader/BmpWriter (используются также в ПР7).</w:t>
-      </w:r>
-    </w:p>
-    <w:p>
-      <w:pPr>
-        <w:ind w:firstLine="0"/>
-        <w:jc w:val="both"/>
-      </w:pPr>
-      <w:r>
-        <w:rPr>
-          <w:rFonts w:ascii="Times New Roman" w:hAnsi="Times New Roman"/>
-          <w:sz w:val="28"/>
-        </w:rPr>
-        <w:t>• domain/lsb_bmp_vigenere/services/vigenere_cipher.py — Виженер по байтам mod 256.</w:t>
-      </w:r>
-    </w:p>
-    <w:p>
-      <w:pPr>
-        <w:ind w:firstLine="0"/>
-        <w:jc w:val="both"/>
-      </w:pPr>
-      <w:r>
-        <w:rPr>
-          <w:rFonts w:ascii="Times New Roman" w:hAnsi="Times New Roman"/>
-          <w:sz w:val="28"/>
-        </w:rPr>
-        <w:t>• domain/lsb_bmp_vigenere/services/marker_packager.py — обёртка start/end-марками.</w:t>
-      </w:r>
-    </w:p>
-    <w:p>
-      <w:pPr>
-        <w:ind w:firstLine="0"/>
-        <w:jc w:val="both"/>
-      </w:pPr>
-      <w:r>
-        <w:rPr>
-          <w:rFonts w:ascii="Times New Roman" w:hAnsi="Times New Roman"/>
-          <w:sz w:val="28"/>
-        </w:rPr>
-        <w:t>• domain/lsb_bmp_vigenere/services/lsb_embedder.py / lsb_extractor.py — низкоуровневая вставка/извлечение LSB.</w:t>
-      </w:r>
-    </w:p>
-    <w:p>
-      <w:pPr>
-        <w:ind w:firstLine="0"/>
-        <w:jc w:val="both"/>
-      </w:pPr>
-      <w:r>
-        <w:rPr>
-          <w:rFonts w:ascii="Times New Roman" w:hAnsi="Times New Roman"/>
-          <w:sz w:val="28"/>
-        </w:rPr>
-        <w:t>• domain/lsb_bmp_vigenere/services/secret_embedder.py / secret_extractor.py — высокоуровневые операции «зашифровать+встроить» / «извлечь+расшифровать».</w:t>
-      </w:r>
-    </w:p>
-    <w:p>
-      <w:pPr>
-        <w:ind w:firstLine="0"/>
-        <w:jc w:val="both"/>
-      </w:pPr>
-      <w:r>
-        <w:rPr>
-          <w:rFonts w:ascii="Times New Roman" w:hAnsi="Times New Roman"/>
-          <w:sz w:val="28"/>
-        </w:rPr>
-        <w:t>• infrastructure/bmp/ — реализация BmpReader/BmpWriter через Pillow.</w:t>
-      </w:r>
-    </w:p>
-    <w:p>
-      <w:pPr>
-        <w:ind w:firstLine="0"/>
-        <w:jc w:val="both"/>
-      </w:pPr>
-      <w:r>
-        <w:rPr>
-          <w:rFonts w:ascii="Times New Roman" w:hAnsi="Times New Roman"/>
-          <w:sz w:val="28"/>
-        </w:rPr>
-        <w:t>• application/commands/lsb_bmp_vigenere/{embed,extract}.py — async Command Handlers.</w:t>
-      </w:r>
-    </w:p>
-    <w:p>
-      <w:pPr>
-        <w:ind w:firstLine="0"/>
-        <w:jc w:val="both"/>
-      </w:pPr>
-      <w:r>
-        <w:rPr>
-          <w:rFonts w:ascii="Times New Roman" w:hAnsi="Times New Roman"/>
-          <w:sz w:val="28"/>
-        </w:rPr>
-        <w:t>• presentation/cli/handlers/lsb_bmp_vigenere.py — click-команды с инжектом через dishka.</w:t>
-      </w:r>
-    </w:p>
-    <w:p>
-      <w:pPr>
-        <w:spacing w:before="240" w:after="120"/>
-        <w:ind w:firstLine="0"/>
-        <w:jc w:val="center"/>
-      </w:pPr>
-      <w:r>
-        <w:rPr>
-          <w:rFonts w:ascii="Times New Roman" w:hAnsi="Times New Roman"/>
-          <w:b/>
-          <w:sz w:val="28"/>
-        </w:rPr>
-        <w:t>5. Ключевые фрагменты кода</w:t>
-      </w:r>
-    </w:p>
-    <w:p>
-      <w:pPr>
-        <w:spacing w:before="80" w:after="160"/>
-        <w:ind w:firstLine="0"/>
-        <w:jc w:val="center"/>
-      </w:pPr>
-      <w:r>
-        <w:rPr>
-          <w:rFonts w:ascii="Times New Roman" w:hAnsi="Times New Roman"/>
-          <w:i/>
-          <w:sz w:val="26"/>
-        </w:rPr>
-        <w:t>Листинг 1 — модифицированный шифр Виженера</w:t>
-      </w:r>
-    </w:p>
-    <w:p>
-      <w:pPr>
-        <w:spacing w:after="0" w:line="240" w:lineRule="auto"/>
-        <w:ind w:firstLine="0" w:left="283"/>
-      </w:pPr>
-      <w:r>
-        <w:rPr>
-          <w:rFonts w:ascii="Courier New" w:hAnsi="Courier New"/>
-          <w:color w:val="101010"/>
-          <w:sz w:val="20"/>
-        </w:rPr>
-        <w:t>class VigenereCipher:</w:t>
-      </w:r>
-    </w:p>
-    <w:p>
-      <w:pPr>
-        <w:spacing w:after="0" w:line="240" w:lineRule="auto"/>
-        <w:ind w:firstLine="0" w:left="283"/>
-      </w:pPr>
-      <w:r>
-        <w:rPr>
-          <w:rFonts w:ascii="Courier New" w:hAnsi="Courier New"/>
-          <w:color w:val="101010"/>
-          <w:sz w:val="20"/>
-        </w:rPr>
-        <w:t xml:space="preserve">    """Симметричное шифрование байтового потока на основе ключа."""</w:t>
-      </w:r>
-    </w:p>
-    <w:p>
-      <w:pPr>
-        <w:spacing w:after="0" w:line="240" w:lineRule="auto"/>
-        <w:ind w:firstLine="0" w:left="283"/>
-      </w:pPr>
-      <w:r>
-        <w:rPr>
-          <w:rFonts w:ascii="Courier New" w:hAnsi="Courier New"/>
-          <w:color w:val="101010"/>
-          <w:sz w:val="20"/>
-        </w:rPr>
-        <w:t xml:space="preserve"> </w:t>
-      </w:r>
-    </w:p>
-    <w:p>
-      <w:pPr>
-        <w:spacing w:after="0" w:line="240" w:lineRule="auto"/>
-        <w:ind w:firstLine="0" w:left="283"/>
-      </w:pPr>
-      <w:r>
-        <w:rPr>
-          <w:rFonts w:ascii="Courier New" w:hAnsi="Courier New"/>
-          <w:color w:val="101010"/>
-          <w:sz w:val="20"/>
-        </w:rPr>
-        <w:t xml:space="preserve">    def encrypt(self, data: bytes, key: str) -&gt; bytes:</w:t>
-      </w:r>
-    </w:p>
-    <w:p>
-      <w:pPr>
-        <w:spacing w:after="0" w:line="240" w:lineRule="auto"/>
-        <w:ind w:firstLine="0" w:left="283"/>
-      </w:pPr>
-      <w:r>
-        <w:rPr>
-          <w:rFonts w:ascii="Courier New" w:hAnsi="Courier New"/>
-          <w:color w:val="101010"/>
-          <w:sz w:val="20"/>
-        </w:rPr>
-        <w:t xml:space="preserve">        key_bytes = self._key_bytes(key)</w:t>
-      </w:r>
-    </w:p>
-    <w:p>
-      <w:pPr>
-        <w:spacing w:after="0" w:line="240" w:lineRule="auto"/>
-        <w:ind w:firstLine="0" w:left="283"/>
-      </w:pPr>
-      <w:r>
-        <w:rPr>
-          <w:rFonts w:ascii="Courier New" w:hAnsi="Courier New"/>
-          <w:color w:val="101010"/>
-          <w:sz w:val="20"/>
-        </w:rPr>
-        <w:t xml:space="preserve">        return bytes(</w:t>
-      </w:r>
-    </w:p>
-    <w:p>
-      <w:pPr>
-        <w:spacing w:after="0" w:line="240" w:lineRule="auto"/>
-        <w:ind w:firstLine="0" w:left="283"/>
-      </w:pPr>
-      <w:r>
-        <w:rPr>
-          <w:rFonts w:ascii="Courier New" w:hAnsi="Courier New"/>
-          <w:color w:val="101010"/>
-          <w:sz w:val="20"/>
-        </w:rPr>
-        <w:t xml:space="preserve">            (byte + key_bytes[index % len(key_bytes)]) % 256</w:t>
-      </w:r>
-    </w:p>
-    <w:p>
-      <w:pPr>
-        <w:spacing w:after="0" w:line="240" w:lineRule="auto"/>
-        <w:ind w:firstLine="0" w:left="283"/>
-      </w:pPr>
-      <w:r>
-        <w:rPr>
-          <w:rFonts w:ascii="Courier New" w:hAnsi="Courier New"/>
-          <w:color w:val="101010"/>
-          <w:sz w:val="20"/>
-        </w:rPr>
-        <w:t xml:space="preserve">            for index, byte in enumerate(data)</w:t>
-      </w:r>
-    </w:p>
-    <w:p>
-      <w:pPr>
-        <w:spacing w:after="0" w:line="240" w:lineRule="auto"/>
-        <w:ind w:firstLine="0" w:left="283"/>
-      </w:pPr>
-      <w:r>
-        <w:rPr>
-          <w:rFonts w:ascii="Courier New" w:hAnsi="Courier New"/>
-          <w:color w:val="101010"/>
-          <w:sz w:val="20"/>
-        </w:rPr>
-        <w:t xml:space="preserve">        )</w:t>
-      </w:r>
-    </w:p>
-    <w:p>
-      <w:pPr>
-        <w:spacing w:after="0" w:line="240" w:lineRule="auto"/>
-        <w:ind w:firstLine="0" w:left="283"/>
-      </w:pPr>
-      <w:r>
-        <w:rPr>
-          <w:rFonts w:ascii="Courier New" w:hAnsi="Courier New"/>
-          <w:color w:val="101010"/>
-          <w:sz w:val="20"/>
-        </w:rPr>
-        <w:t xml:space="preserve"> </w:t>
-      </w:r>
-    </w:p>
-    <w:p>
-      <w:pPr>
-        <w:spacing w:after="0" w:line="240" w:lineRule="auto"/>
-        <w:ind w:firstLine="0" w:left="283"/>
-      </w:pPr>
-      <w:r>
-        <w:rPr>
-          <w:rFonts w:ascii="Courier New" w:hAnsi="Courier New"/>
-          <w:color w:val="101010"/>
-          <w:sz w:val="20"/>
-        </w:rPr>
-        <w:t xml:space="preserve">    def decrypt(self, data: bytes, key: str) -&gt; bytes:</w:t>
-      </w:r>
-    </w:p>
-    <w:p>
-      <w:pPr>
-        <w:spacing w:after="0" w:line="240" w:lineRule="auto"/>
-        <w:ind w:firstLine="0" w:left="283"/>
-      </w:pPr>
-      <w:r>
-        <w:rPr>
-          <w:rFonts w:ascii="Courier New" w:hAnsi="Courier New"/>
-          <w:color w:val="101010"/>
-          <w:sz w:val="20"/>
-        </w:rPr>
-        <w:t xml:space="preserve">        key_bytes = self._key_bytes(key)</w:t>
-      </w:r>
-    </w:p>
-    <w:p>
-      <w:pPr>
-        <w:spacing w:after="0" w:line="240" w:lineRule="auto"/>
-        <w:ind w:firstLine="0" w:left="283"/>
-      </w:pPr>
-      <w:r>
-        <w:rPr>
-          <w:rFonts w:ascii="Courier New" w:hAnsi="Courier New"/>
-          <w:color w:val="101010"/>
-          <w:sz w:val="20"/>
-        </w:rPr>
-        <w:t xml:space="preserve">        return bytes(</w:t>
-      </w:r>
-    </w:p>
-    <w:p>
-      <w:pPr>
-        <w:spacing w:after="0" w:line="240" w:lineRule="auto"/>
-        <w:ind w:firstLine="0" w:left="283"/>
-      </w:pPr>
-      <w:r>
-        <w:rPr>
-          <w:rFonts w:ascii="Courier New" w:hAnsi="Courier New"/>
-          <w:color w:val="101010"/>
-          <w:sz w:val="20"/>
-        </w:rPr>
-        <w:t xml:space="preserve">            (byte - key_bytes[index % len(key_bytes)]) % 256</w:t>
-      </w:r>
-    </w:p>
-    <w:p>
-      <w:pPr>
-        <w:spacing w:after="0" w:line="240" w:lineRule="auto"/>
-        <w:ind w:firstLine="0" w:left="283"/>
-      </w:pPr>
-      <w:r>
-        <w:rPr>
-          <w:rFonts w:ascii="Courier New" w:hAnsi="Courier New"/>
-          <w:color w:val="101010"/>
-          <w:sz w:val="20"/>
-        </w:rPr>
-        <w:t xml:space="preserve">            for index, byte in enumerate(data)</w:t>
-      </w:r>
-    </w:p>
-    <w:p>
-      <w:pPr>
-        <w:spacing w:after="0" w:line="240" w:lineRule="auto"/>
-        <w:ind w:firstLine="0" w:left="283"/>
-      </w:pPr>
-      <w:r>
-        <w:rPr>
-          <w:rFonts w:ascii="Courier New" w:hAnsi="Courier New"/>
-          <w:color w:val="101010"/>
-          <w:sz w:val="20"/>
-        </w:rPr>
-        <w:t xml:space="preserve">        )</w:t>
-      </w:r>
-    </w:p>
-    <w:p>
-      <w:pPr>
-        <w:spacing w:before="80" w:after="160"/>
-        <w:ind w:firstLine="0"/>
-        <w:jc w:val="center"/>
-      </w:pPr>
-      <w:r>
-        <w:rPr>
-          <w:rFonts w:ascii="Times New Roman" w:hAnsi="Times New Roman"/>
-          <w:i/>
-          <w:sz w:val="26"/>
-        </w:rPr>
-        <w:t>Листинг 2 — встраивание байтов в LSB каналов</w:t>
-      </w:r>
-    </w:p>
-    <w:p>
-      <w:pPr>
-        <w:spacing w:after="0" w:line="240" w:lineRule="auto"/>
-        <w:ind w:firstLine="0" w:left="283"/>
-      </w:pPr>
-      <w:r>
-        <w:rPr>
-          <w:rFonts w:ascii="Courier New" w:hAnsi="Courier New"/>
-          <w:color w:val="101010"/>
-          <w:sz w:val="20"/>
-        </w:rPr>
-        <w:t>class LsbEmbedder:</w:t>
-      </w:r>
-    </w:p>
-    <w:p>
-      <w:pPr>
-        <w:spacing w:after="0" w:line="240" w:lineRule="auto"/>
-        <w:ind w:firstLine="0" w:left="283"/>
-      </w:pPr>
-      <w:r>
-        <w:rPr>
-          <w:rFonts w:ascii="Courier New" w:hAnsi="Courier New"/>
-          <w:color w:val="101010"/>
-          <w:sz w:val="20"/>
-        </w:rPr>
-        <w:t xml:space="preserve">    """Записывает байты сообщения в LSB каналов изображения."""</w:t>
-      </w:r>
-    </w:p>
-    <w:p>
-      <w:pPr>
-        <w:spacing w:after="0" w:line="240" w:lineRule="auto"/>
-        <w:ind w:firstLine="0" w:left="283"/>
-      </w:pPr>
-      <w:r>
-        <w:rPr>
-          <w:rFonts w:ascii="Courier New" w:hAnsi="Courier New"/>
-          <w:color w:val="101010"/>
-          <w:sz w:val="20"/>
-        </w:rPr>
-        <w:t xml:space="preserve"> </w:t>
-      </w:r>
-    </w:p>
-    <w:p>
-      <w:pPr>
-        <w:spacing w:after="0" w:line="240" w:lineRule="auto"/>
-        <w:ind w:firstLine="0" w:left="283"/>
-      </w:pPr>
-      <w:r>
-        <w:rPr>
-          <w:rFonts w:ascii="Courier New" w:hAnsi="Courier New"/>
-          <w:color w:val="101010"/>
-          <w:sz w:val="20"/>
-        </w:rPr>
-        <w:t xml:space="preserve">    def embed(self, image: BmpImage, payload: bytes) -&gt; BmpImage:</w:t>
-      </w:r>
-    </w:p>
-    <w:p>
-      <w:pPr>
-        <w:spacing w:after="0" w:line="240" w:lineRule="auto"/>
-        <w:ind w:firstLine="0" w:left="283"/>
-      </w:pPr>
-      <w:r>
-        <w:rPr>
-          <w:rFonts w:ascii="Courier New" w:hAnsi="Courier New"/>
-          <w:color w:val="101010"/>
-          <w:sz w:val="20"/>
-        </w:rPr>
-        <w:t xml:space="preserve">        bits = self._bytes_to_bits(payload)</w:t>
-      </w:r>
-    </w:p>
-    <w:p>
-      <w:pPr>
-        <w:spacing w:after="0" w:line="240" w:lineRule="auto"/>
-        <w:ind w:firstLine="0" w:left="283"/>
-      </w:pPr>
-      <w:r>
-        <w:rPr>
-          <w:rFonts w:ascii="Courier New" w:hAnsi="Courier New"/>
-          <w:color w:val="101010"/>
-          <w:sz w:val="20"/>
-        </w:rPr>
-        <w:t xml:space="preserve">        capacity = image.total_pixels * 3</w:t>
-      </w:r>
-    </w:p>
-    <w:p>
-      <w:pPr>
-        <w:spacing w:after="0" w:line="240" w:lineRule="auto"/>
-        <w:ind w:firstLine="0" w:left="283"/>
-      </w:pPr>
-      <w:r>
-        <w:rPr>
-          <w:rFonts w:ascii="Courier New" w:hAnsi="Courier New"/>
-          <w:color w:val="101010"/>
-          <w:sz w:val="20"/>
-        </w:rPr>
-        <w:t xml:space="preserve">        if len(bits) &gt; capacity:</w:t>
-      </w:r>
-    </w:p>
-    <w:p>
-      <w:pPr>
-        <w:spacing w:after="0" w:line="240" w:lineRule="auto"/>
-        <w:ind w:firstLine="0" w:left="283"/>
-      </w:pPr>
-      <w:r>
-        <w:rPr>
-          <w:rFonts w:ascii="Courier New" w:hAnsi="Courier New"/>
-          <w:color w:val="101010"/>
-          <w:sz w:val="20"/>
-        </w:rPr>
-        <w:t xml:space="preserve">            raise ContainerTooSmallError(</w:t>
-      </w:r>
-    </w:p>
-    <w:p>
-      <w:pPr>
-        <w:spacing w:after="0" w:line="240" w:lineRule="auto"/>
-        <w:ind w:firstLine="0" w:left="283"/>
-      </w:pPr>
-      <w:r>
-        <w:rPr>
-          <w:rFonts w:ascii="Courier New" w:hAnsi="Courier New"/>
-          <w:color w:val="101010"/>
-          <w:sz w:val="20"/>
-        </w:rPr>
-        <w:t xml:space="preserve">                required_bits=len(bits), available_bits=capacity,</w:t>
-      </w:r>
-    </w:p>
-    <w:p>
-      <w:pPr>
-        <w:spacing w:after="0" w:line="240" w:lineRule="auto"/>
-        <w:ind w:firstLine="0" w:left="283"/>
-      </w:pPr>
-      <w:r>
-        <w:rPr>
-          <w:rFonts w:ascii="Courier New" w:hAnsi="Courier New"/>
-          <w:color w:val="101010"/>
-          <w:sz w:val="20"/>
-        </w:rPr>
-        <w:t xml:space="preserve">            )</w:t>
-      </w:r>
-    </w:p>
-    <w:p>
-      <w:pPr>
-        <w:spacing w:after="0" w:line="240" w:lineRule="auto"/>
-        <w:ind w:firstLine="0" w:left="283"/>
-      </w:pPr>
-      <w:r>
-        <w:rPr>
-          <w:rFonts w:ascii="Courier New" w:hAnsi="Courier New"/>
-          <w:color w:val="101010"/>
-          <w:sz w:val="20"/>
-        </w:rPr>
-        <w:t xml:space="preserve"> </w:t>
-      </w:r>
-    </w:p>
-    <w:p>
-      <w:pPr>
-        <w:spacing w:after="0" w:line="240" w:lineRule="auto"/>
-        <w:ind w:firstLine="0" w:left="283"/>
-      </w:pPr>
-      <w:r>
-        <w:rPr>
-          <w:rFonts w:ascii="Courier New" w:hAnsi="Courier New"/>
-          <w:color w:val="101010"/>
-          <w:sz w:val="20"/>
-        </w:rPr>
-        <w:t xml:space="preserve">        flat_pixels = list(image.flatten())</w:t>
-      </w:r>
-    </w:p>
-    <w:p>
-      <w:pPr>
-        <w:spacing w:after="0" w:line="240" w:lineRule="auto"/>
-        <w:ind w:firstLine="0" w:left="283"/>
-      </w:pPr>
-      <w:r>
-        <w:rPr>
-          <w:rFonts w:ascii="Courier New" w:hAnsi="Courier New"/>
-          <w:color w:val="101010"/>
-          <w:sz w:val="20"/>
-        </w:rPr>
-        <w:t xml:space="preserve">        for bit_index, bit in enumerate(bits):</w:t>
-      </w:r>
-    </w:p>
-    <w:p>
-      <w:pPr>
-        <w:spacing w:after="0" w:line="240" w:lineRule="auto"/>
-        <w:ind w:firstLine="0" w:left="283"/>
-      </w:pPr>
-      <w:r>
-        <w:rPr>
-          <w:rFonts w:ascii="Courier New" w:hAnsi="Courier New"/>
-          <w:color w:val="101010"/>
-          <w:sz w:val="20"/>
-        </w:rPr>
-        <w:t xml:space="preserve">            pixel_index, channel_index = divmod(bit_index, 3)</w:t>
-      </w:r>
-    </w:p>
-    <w:p>
-      <w:pPr>
-        <w:spacing w:after="0" w:line="240" w:lineRule="auto"/>
-        <w:ind w:firstLine="0" w:left="283"/>
-      </w:pPr>
-      <w:r>
-        <w:rPr>
-          <w:rFonts w:ascii="Courier New" w:hAnsi="Courier New"/>
-          <w:color w:val="101010"/>
-          <w:sz w:val="20"/>
-        </w:rPr>
-        <w:t xml:space="preserve">            flat_pixels[pixel_index] = _set_channel_lsb(</w:t>
-      </w:r>
-    </w:p>
-    <w:p>
-      <w:pPr>
-        <w:spacing w:after="0" w:line="240" w:lineRule="auto"/>
-        <w:ind w:firstLine="0" w:left="283"/>
-      </w:pPr>
-      <w:r>
-        <w:rPr>
-          <w:rFonts w:ascii="Courier New" w:hAnsi="Courier New"/>
-          <w:color w:val="101010"/>
-          <w:sz w:val="20"/>
-        </w:rPr>
-        <w:t xml:space="preserve">                flat_pixels[pixel_index], channel_index, bit,</w:t>
-      </w:r>
-    </w:p>
-    <w:p>
-      <w:pPr>
-        <w:spacing w:after="0" w:line="240" w:lineRule="auto"/>
-        <w:ind w:firstLine="0" w:left="283"/>
-      </w:pPr>
-      <w:r>
-        <w:rPr>
-          <w:rFonts w:ascii="Courier New" w:hAnsi="Courier New"/>
-          <w:color w:val="101010"/>
-          <w:sz w:val="20"/>
-        </w:rPr>
-        <w:t xml:space="preserve">            )</w:t>
-      </w:r>
-    </w:p>
-    <w:p>
-      <w:pPr>
-        <w:spacing w:after="0" w:line="240" w:lineRule="auto"/>
-        <w:ind w:firstLine="0" w:left="283"/>
-      </w:pPr>
-      <w:r>
-        <w:rPr>
-          <w:rFonts w:ascii="Courier New" w:hAnsi="Courier New"/>
-          <w:color w:val="101010"/>
-          <w:sz w:val="20"/>
-        </w:rPr>
-        <w:t xml:space="preserve">        return BmpImage.from_flat(image.width, image.height, flat_pixels)</w:t>
-      </w:r>
-    </w:p>
-    <w:p>
-      <w:r>
-        <w:br w:type="page"/>
-      </w:r>
-    </w:p>
-    <w:p>
-      <w:pPr>
-        <w:spacing w:before="240" w:after="120"/>
-        <w:ind w:firstLine="0"/>
-        <w:jc w:val="center"/>
-      </w:pPr>
-      <w:r>
-        <w:rPr>
-          <w:rFonts w:ascii="Times New Roman" w:hAnsi="Times New Roman"/>
-          <w:b/>
-          <w:sz w:val="28"/>
-        </w:rPr>
-        <w:t>6. Демонстрация работы</w:t>
-      </w:r>
-    </w:p>
-    <w:p>
-      <w:pPr>
-        <w:jc w:val="both"/>
-      </w:pPr>
-      <w:r>
-        <w:rPr>
-          <w:rFonts w:ascii="Times New Roman" w:hAnsi="Times New Roman"/>
-          <w:sz w:val="28"/>
-        </w:rPr>
-        <w:t>В качестве cover-контейнера использовано BMP-изображение 64×64 пикселя (resources/bmp_samples/sample_64.bmp). Полезная нагрузка — сообщение «Стеганография защищает данные от перехвата.», ключ Виженера «MyKey-2025». После встраивания и сохранения нового файла программа извлечения восстановила сообщение целиком.</w:t>
+        <w:t>4. Исходные данные</w:t>
       </w:r>
     </w:p>
     <w:tbl>
@@ -1162,7 +588,6 @@
           </w:tcPr>
           <w:p>
             <w:pPr>
-              <w:spacing w:line="240" w:lineRule="auto"/>
               <w:ind w:firstLine="0"/>
               <w:jc w:val="center"/>
             </w:pPr>
@@ -1171,9 +596,10 @@
               <w:rPr>
                 <w:rFonts w:ascii="Times New Roman" w:hAnsi="Times New Roman"/>
                 <w:b/>
-                <w:sz w:val="24"/>
+                <w:i w:val="0"/>
+                <w:sz w:val="22"/>
               </w:rPr>
-              <w:t>Поле</w:t>
+              <w:t>Параметр</w:t>
             </w:r>
           </w:p>
         </w:tc>
@@ -1183,7 +609,6 @@
           </w:tcPr>
           <w:p>
             <w:pPr>
-              <w:spacing w:line="240" w:lineRule="auto"/>
               <w:ind w:firstLine="0"/>
               <w:jc w:val="center"/>
             </w:pPr>
@@ -1192,7 +617,8 @@
               <w:rPr>
                 <w:rFonts w:ascii="Times New Roman" w:hAnsi="Times New Roman"/>
                 <w:b/>
-                <w:sz w:val="24"/>
+                <w:i w:val="0"/>
+                <w:sz w:val="22"/>
               </w:rPr>
               <w:t>Значение</w:t>
             </w:r>
@@ -1213,9 +639,11 @@
             <w:r>
               <w:rPr>
                 <w:rFonts w:ascii="Times New Roman" w:hAnsi="Times New Roman"/>
-                <w:sz w:val="24"/>
+                <w:b w:val="0"/>
+                <w:i w:val="0"/>
+                <w:sz w:val="22"/>
               </w:rPr>
-              <w:t>Cover-контейнер</w:t>
+              <w:t>Контейнер</w:t>
             </w:r>
           </w:p>
         </w:tc>
@@ -1232,9 +660,11 @@
             <w:r>
               <w:rPr>
                 <w:rFonts w:ascii="Times New Roman" w:hAnsi="Times New Roman"/>
-                <w:sz w:val="24"/>
+                <w:b w:val="0"/>
+                <w:i w:val="0"/>
+                <w:sz w:val="22"/>
               </w:rPr>
-              <w:t>resources/bmp_samples/sample_64.bmp</w:t>
+              <w:t>container.bmp (реальное фото, 160×200 пикселей)</w:t>
             </w:r>
           </w:p>
         </w:tc>
@@ -1253,9 +683,11 @@
             <w:r>
               <w:rPr>
                 <w:rFonts w:ascii="Times New Roman" w:hAnsi="Times New Roman"/>
-                <w:sz w:val="24"/>
+                <w:b w:val="0"/>
+                <w:i w:val="0"/>
+                <w:sz w:val="22"/>
               </w:rPr>
-              <w:t>Размер изображения</w:t>
+              <w:t>Формат контейнера</w:t>
             </w:r>
           </w:p>
         </w:tc>
@@ -1272,9 +704,11 @@
             <w:r>
               <w:rPr>
                 <w:rFonts w:ascii="Times New Roman" w:hAnsi="Times New Roman"/>
-                <w:sz w:val="24"/>
+                <w:b w:val="0"/>
+                <w:i w:val="0"/>
+                <w:sz w:val="22"/>
               </w:rPr>
-              <w:t>64 × 64 пикселя</w:t>
+              <w:t>BMP, 24 бита, без компрессии</w:t>
             </w:r>
           </w:p>
         </w:tc>
@@ -1293,7 +727,9 @@
             <w:r>
               <w:rPr>
                 <w:rFonts w:ascii="Times New Roman" w:hAnsi="Times New Roman"/>
-                <w:sz w:val="24"/>
+                <w:b w:val="0"/>
+                <w:i w:val="0"/>
+                <w:sz w:val="22"/>
               </w:rPr>
               <w:t>Файл-результат</w:t>
             </w:r>
@@ -1312,9 +748,11 @@
             <w:r>
               <w:rPr>
                 <w:rFonts w:ascii="Times New Roman" w:hAnsi="Times New Roman"/>
-                <w:sz w:val="24"/>
+                <w:b w:val="0"/>
+                <w:i w:val="0"/>
+                <w:sz w:val="22"/>
               </w:rPr>
-              <w:t>resources/bmp_samples/stego_pr6.bmp</w:t>
+              <w:t>container1.bmp</w:t>
             </w:r>
           </w:p>
         </w:tc>
@@ -1333,9 +771,11 @@
             <w:r>
               <w:rPr>
                 <w:rFonts w:ascii="Times New Roman" w:hAnsi="Times New Roman"/>
-                <w:sz w:val="24"/>
+                <w:b w:val="0"/>
+                <w:i w:val="0"/>
+                <w:sz w:val="22"/>
               </w:rPr>
-              <w:t>Открытый текст</w:t>
+              <w:t>Сообщение</w:t>
             </w:r>
           </w:p>
         </w:tc>
@@ -1352,9 +792,11 @@
             <w:r>
               <w:rPr>
                 <w:rFonts w:ascii="Times New Roman" w:hAnsi="Times New Roman"/>
-                <w:sz w:val="24"/>
+                <w:b w:val="0"/>
+                <w:i w:val="0"/>
+                <w:sz w:val="22"/>
               </w:rPr>
-              <w:t>Стеганография защищает данные от перехвата.</w:t>
+              <w:t>prim.txt (кириллица, кодировка Windows/cp1251)</w:t>
             </w:r>
           </w:p>
         </w:tc>
@@ -1373,9 +815,11 @@
             <w:r>
               <w:rPr>
                 <w:rFonts w:ascii="Times New Roman" w:hAnsi="Times New Roman"/>
-                <w:sz w:val="24"/>
+                <w:b w:val="0"/>
+                <w:i w:val="0"/>
+                <w:sz w:val="22"/>
               </w:rPr>
-              <w:t>Ключ</w:t>
+              <w:t>Объём сообщения</w:t>
             </w:r>
           </w:p>
         </w:tc>
@@ -1392,9 +836,11 @@
             <w:r>
               <w:rPr>
                 <w:rFonts w:ascii="Times New Roman" w:hAnsi="Times New Roman"/>
-                <w:sz w:val="24"/>
+                <w:b w:val="0"/>
+                <w:i w:val="0"/>
+                <w:sz w:val="22"/>
               </w:rPr>
-              <w:t>MyKey-2025</w:t>
+              <w:t>393 байта</w:t>
             </w:r>
           </w:p>
         </w:tc>
@@ -1413,9 +859,11 @@
             <w:r>
               <w:rPr>
                 <w:rFonts w:ascii="Times New Roman" w:hAnsi="Times New Roman"/>
-                <w:sz w:val="24"/>
+                <w:b w:val="0"/>
+                <w:i w:val="0"/>
+                <w:sz w:val="22"/>
               </w:rPr>
-              <w:t>Полезных бит</w:t>
+              <w:t>Секретный ключ</w:t>
             </w:r>
           </w:p>
         </w:tc>
@@ -1432,9 +880,11 @@
             <w:r>
               <w:rPr>
                 <w:rFonts w:ascii="Times New Roman" w:hAnsi="Times New Roman"/>
-                <w:sz w:val="24"/>
+                <w:b w:val="0"/>
+                <w:i w:val="0"/>
+                <w:sz w:val="22"/>
               </w:rPr>
-              <w:t>760</w:t>
+              <w:t>@JeKc-I980  (Nk = 10)</w:t>
             </w:r>
           </w:p>
         </w:tc>
@@ -1453,9 +903,11 @@
             <w:r>
               <w:rPr>
                 <w:rFonts w:ascii="Times New Roman" w:hAnsi="Times New Roman"/>
-                <w:sz w:val="24"/>
+                <w:b w:val="0"/>
+                <w:i w:val="0"/>
+                <w:sz w:val="22"/>
               </w:rPr>
-              <w:t>Ёмкость контейнера (бит)</w:t>
+              <w:t>Метка начала</w:t>
             </w:r>
           </w:p>
         </w:tc>
@@ -1472,9 +924,11 @@
             <w:r>
               <w:rPr>
                 <w:rFonts w:ascii="Times New Roman" w:hAnsi="Times New Roman"/>
-                <w:sz w:val="24"/>
+                <w:b w:val="0"/>
+                <w:i w:val="0"/>
+                <w:sz w:val="22"/>
               </w:rPr>
-              <w:t>12288</w:t>
+              <w:t>n0G@m0k</w:t>
             </w:r>
           </w:p>
         </w:tc>
@@ -1493,9 +947,11 @@
             <w:r>
               <w:rPr>
                 <w:rFonts w:ascii="Times New Roman" w:hAnsi="Times New Roman"/>
-                <w:sz w:val="24"/>
+                <w:b w:val="0"/>
+                <w:i w:val="0"/>
+                <w:sz w:val="22"/>
               </w:rPr>
-              <w:t>Использовано ёмкости</w:t>
+              <w:t>Метка конца</w:t>
             </w:r>
           </w:p>
         </w:tc>
@@ -1512,9 +968,11 @@
             <w:r>
               <w:rPr>
                 <w:rFonts w:ascii="Times New Roman" w:hAnsi="Times New Roman"/>
-                <w:sz w:val="24"/>
+                <w:b w:val="0"/>
+                <w:i w:val="0"/>
+                <w:sz w:val="22"/>
               </w:rPr>
-              <w:t>6.18%</w:t>
+              <w:t>KiHeu,6</w:t>
             </w:r>
           </w:p>
         </w:tc>
@@ -1533,9 +991,11 @@
             <w:r>
               <w:rPr>
                 <w:rFonts w:ascii="Times New Roman" w:hAnsi="Times New Roman"/>
-                <w:sz w:val="24"/>
+                <w:b w:val="0"/>
+                <w:i w:val="0"/>
+                <w:sz w:val="22"/>
               </w:rPr>
-              <w:t>Восстановленное сообщение</w:t>
+              <w:t>Алфавит источника</w:t>
             </w:r>
           </w:p>
         </w:tc>
@@ -1552,9 +1012,11 @@
             <w:r>
               <w:rPr>
                 <w:rFonts w:ascii="Times New Roman" w:hAnsi="Times New Roman"/>
-                <w:sz w:val="24"/>
+                <w:b w:val="0"/>
+                <w:i w:val="0"/>
+                <w:sz w:val="22"/>
               </w:rPr>
-              <w:t>Стеганография защищает данные от перехвата.</w:t>
+              <w:t>ASCII-коды 0…255 (Na = 256)</w:t>
             </w:r>
           </w:p>
         </w:tc>
@@ -1562,44 +1024,2333 @@
     </w:tbl>
     <w:p>
       <w:pPr>
-        <w:spacing w:before="80" w:after="160"/>
+        <w:spacing w:before="40" w:after="200"/>
         <w:ind w:firstLine="0"/>
         <w:jc w:val="center"/>
       </w:pPr>
       <w:r>
         <w:rPr>
           <w:rFonts w:ascii="Times New Roman" w:hAnsi="Times New Roman"/>
+          <w:b w:val="0"/>
           <w:i/>
-          <w:sz w:val="26"/>
+          <w:sz w:val="24"/>
         </w:rPr>
-        <w:t>Таблица 1 — Параметры встраивания и результат извлечения</w:t>
+        <w:t>Таблица 1 — Исходные данные и параметры встраивания</w:t>
       </w:r>
     </w:p>
     <w:p>
       <w:pPr>
-        <w:spacing w:before="240" w:after="120"/>
+        <w:spacing w:after="80" w:line="360" w:lineRule="auto"/>
+        <w:ind w:firstLine="709"/>
+        <w:jc w:val="both"/>
+      </w:pPr>
+      <w:r>
+        <w:rPr>
+          <w:rFonts w:ascii="Times New Roman" w:hAnsi="Times New Roman"/>
+          <w:b w:val="0"/>
+          <w:i w:val="0"/>
+          <w:sz w:val="28"/>
+        </w:rPr>
+        <w:t>Контейнер выбран как «зашумлённое» реальное изображение: в отличие от гладких («чистых») изображений, в фотографии отсутствуют строгие зависимости между младшими и старшими битами, поэтому факт встраивания обнаружить существенно сложнее. Ориентировочное соотношение объёмов контейнера и сообщения для метода НЗБ — не менее 8:1; здесь оно многократно выполняется.</w:t>
+      </w:r>
+    </w:p>
+    <w:p>
+      <w:pPr>
+        <w:keepNext/>
+        <w:spacing w:before="240" w:after="120" w:line="240" w:lineRule="auto"/>
         <w:ind w:firstLine="0"/>
-        <w:jc w:val="center"/>
+        <w:jc w:val="left"/>
       </w:pPr>
       <w:r>
         <w:rPr>
           <w:rFonts w:ascii="Times New Roman" w:hAnsi="Times New Roman"/>
           <w:b/>
-          <w:sz w:val="32"/>
+          <w:i w:val="0"/>
+          <w:sz w:val="30"/>
+        </w:rPr>
+        <w:t>5. Ход работы</w:t>
+      </w:r>
+    </w:p>
+    <w:p>
+      <w:pPr>
+        <w:spacing w:after="80" w:line="360" w:lineRule="auto"/>
+        <w:ind w:firstLine="709"/>
+        <w:jc w:val="left"/>
+      </w:pPr>
+      <w:r>
+        <w:rPr>
+          <w:rFonts w:ascii="Times New Roman" w:hAnsi="Times New Roman"/>
+          <w:b w:val="0"/>
+          <w:i w:val="0"/>
+          <w:sz w:val="28"/>
+        </w:rPr>
+        <w:t>Реализация выполнена в Mathcad Prime строго по шагам методических указаний. Функции чтения/записи изображений (READRGB, READ_RED/GREEN/BLUE, WRITERGB), работы со строками (str2vec, vec2str, strlen, substr) и матрицами (augment, stack, submatrix) присутствуют в Prime и используются без изменений. Ниже — содержание каждого шага и соответствующие программные модули (M.1–M.14).</w:t>
+      </w:r>
+    </w:p>
+    <w:p>
+      <w:pPr>
+        <w:keepNext/>
+        <w:spacing w:before="200" w:after="60" w:line="240" w:lineRule="auto"/>
+        <w:ind w:firstLine="0"/>
+        <w:jc w:val="left"/>
+      </w:pPr>
+      <w:r>
+        <w:rPr>
+          <w:rFonts w:ascii="Times New Roman" w:hAnsi="Times New Roman"/>
+          <w:b/>
+          <w:i w:val="0"/>
+          <w:sz w:val="26"/>
+        </w:rPr>
+        <w:t>Шаг 1. Импорт контейнера и разложение на цветовые каналы</w:t>
+      </w:r>
+    </w:p>
+    <w:p>
+      <w:pPr>
+        <w:spacing w:after="80" w:line="360" w:lineRule="auto"/>
+        <w:ind w:firstLine="709"/>
+        <w:jc w:val="both"/>
+      </w:pPr>
+      <w:r>
+        <w:rPr>
+          <w:rFonts w:ascii="Times New Roman" w:hAnsi="Times New Roman"/>
+          <w:b w:val="0"/>
+          <w:i w:val="0"/>
+          <w:sz w:val="28"/>
+        </w:rPr>
+        <w:t>Изображение импортируется операцией Insert → Picture. Для обработки его цветовые характеристики переводятся в числовые матрицы: функция READRGB возвращает упакованный массив из трёх подматриц (R, G, B), а функции READ_RED / READ_GREEN / READ_BLUE выделяют отдельные цветовые компоненты.</w:t>
+      </w:r>
+    </w:p>
+    <w:p>
+      <w:pPr>
+        <w:keepLines/>
+        <w:spacing w:before="40" w:after="160" w:line="240" w:lineRule="auto"/>
+        <w:ind w:firstLine="0" w:left="454"/>
+        <w:shd w:val="clear" w:color="auto" w:fill="F2F2F2"/>
+      </w:pPr>
+      <w:r>
+        <w:rPr>
+          <w:rFonts w:ascii="Consolas" w:hAnsi="Consolas"/>
+          <w:b w:val="0"/>
+          <w:i w:val="0"/>
+          <w:sz w:val="21"/>
+        </w:rPr>
+        <w:t>C ≔ READRGB("container.bmp")</w:t>
+        <w:br/>
+      </w:r>
+      <w:r>
+        <w:rPr>
+          <w:rFonts w:ascii="Consolas" w:hAnsi="Consolas"/>
+          <w:b w:val="0"/>
+          <w:i w:val="0"/>
+          <w:sz w:val="21"/>
+        </w:rPr>
+        <w:t>R ≔ READ_RED("container.bmp")</w:t>
+        <w:br/>
+      </w:r>
+      <w:r>
+        <w:rPr>
+          <w:rFonts w:ascii="Consolas" w:hAnsi="Consolas"/>
+          <w:b w:val="0"/>
+          <w:i w:val="0"/>
+          <w:sz w:val="21"/>
+        </w:rPr>
+        <w:t>G ≔ READ_GREEN("container.bmp")</w:t>
+        <w:br/>
+      </w:r>
+      <w:r>
+        <w:rPr>
+          <w:rFonts w:ascii="Consolas" w:hAnsi="Consolas"/>
+          <w:b w:val="0"/>
+          <w:i w:val="0"/>
+          <w:sz w:val="21"/>
+        </w:rPr>
+        <w:t>B ≔ READ_BLUE("container.bmp")</w:t>
+      </w:r>
+    </w:p>
+    <w:p>
+      <w:pPr>
+        <w:spacing w:before="120" w:after="160" w:line="240" w:lineRule="auto"/>
+        <w:ind w:firstLine="0"/>
+        <w:jc w:val="center"/>
+        <w:pBdr>
+          <w:top w:val="dashed" w:sz="8" w:space="6" w:color="808080"/>
+          <w:bottom w:val="dashed" w:sz="8" w:space="6" w:color="808080"/>
+          <w:left w:val="dashed" w:sz="8" w:space="6" w:color="808080"/>
+          <w:right w:val="dashed" w:sz="8" w:space="6" w:color="808080"/>
+        </w:pBdr>
+      </w:pPr>
+      <w:r>
+        <w:rPr>
+          <w:rFonts w:ascii="Times New Roman" w:hAnsi="Times New Roman"/>
+          <w:b w:val="0"/>
+          <w:i/>
+          <w:color w:val="808080"/>
+          <w:sz w:val="22"/>
+        </w:rPr>
+        <w:t>[Рисунок 1 — скрин Mathcad: импортированный контейнер C]</w:t>
+      </w:r>
+    </w:p>
+    <w:p>
+      <w:pPr>
+        <w:spacing w:before="0" w:after="200" w:line="240" w:lineRule="auto"/>
+        <w:ind w:firstLine="0"/>
+        <w:jc w:val="center"/>
+      </w:pPr>
+      <w:r>
+        <w:rPr>
+          <w:rFonts w:ascii="Times New Roman" w:hAnsi="Times New Roman"/>
+          <w:b w:val="0"/>
+          <w:i/>
+          <w:sz w:val="24"/>
+        </w:rPr>
+        <w:t>Рисунок 1 — Изображение-контейнер</w:t>
+      </w:r>
+    </w:p>
+    <w:p>
+      <w:pPr>
+        <w:spacing w:before="120" w:after="160" w:line="240" w:lineRule="auto"/>
+        <w:ind w:firstLine="0"/>
+        <w:jc w:val="center"/>
+        <w:pBdr>
+          <w:top w:val="dashed" w:sz="8" w:space="6" w:color="808080"/>
+          <w:bottom w:val="dashed" w:sz="8" w:space="6" w:color="808080"/>
+          <w:left w:val="dashed" w:sz="8" w:space="6" w:color="808080"/>
+          <w:right w:val="dashed" w:sz="8" w:space="6" w:color="808080"/>
+        </w:pBdr>
+      </w:pPr>
+      <w:r>
+        <w:rPr>
+          <w:rFonts w:ascii="Times New Roman" w:hAnsi="Times New Roman"/>
+          <w:b w:val="0"/>
+          <w:i/>
+          <w:color w:val="808080"/>
+          <w:sz w:val="22"/>
+        </w:rPr>
+        <w:t>[Рисунок 2 — скрин Mathcad: grayscale-интерпретации каналов R, G, B]</w:t>
+      </w:r>
+    </w:p>
+    <w:p>
+      <w:pPr>
+        <w:spacing w:before="0" w:after="200" w:line="240" w:lineRule="auto"/>
+        <w:ind w:firstLine="0"/>
+        <w:jc w:val="center"/>
+      </w:pPr>
+      <w:r>
+        <w:rPr>
+          <w:rFonts w:ascii="Times New Roman" w:hAnsi="Times New Roman"/>
+          <w:b w:val="0"/>
+          <w:i/>
+          <w:sz w:val="24"/>
+        </w:rPr>
+        <w:t>Рисунок 2 — Графическая интерпретация цветовых компонентов контейнера</w:t>
+      </w:r>
+    </w:p>
+    <w:p>
+      <w:pPr>
+        <w:keepNext/>
+        <w:spacing w:before="200" w:after="60" w:line="240" w:lineRule="auto"/>
+        <w:ind w:firstLine="0"/>
+        <w:jc w:val="left"/>
+      </w:pPr>
+      <w:r>
+        <w:rPr>
+          <w:rFonts w:ascii="Times New Roman" w:hAnsi="Times New Roman"/>
+          <w:b/>
+          <w:i w:val="0"/>
+          <w:sz w:val="26"/>
+        </w:rPr>
+        <w:t>Шаг 2. Импорт скрываемого сообщения</w:t>
+      </w:r>
+    </w:p>
+    <w:p>
+      <w:pPr>
+        <w:spacing w:after="80" w:line="360" w:lineRule="auto"/>
+        <w:ind w:firstLine="709"/>
+        <w:jc w:val="both"/>
+      </w:pPr>
+      <w:r>
+        <w:rPr>
+          <w:rFonts w:ascii="Times New Roman" w:hAnsi="Times New Roman"/>
+          <w:b w:val="0"/>
+          <w:i w:val="0"/>
+          <w:sz w:val="28"/>
+        </w:rPr>
+        <w:t>Текстовое сообщение импортируется функцией READBIN как последовательность 8-битных беззнаковых целых (байтов). Результат — вектор-столбец M, каждый элемент которого равен коду соответствующего символа. Проверить импорт можно функцией vec2str(M) (кириллица при отображении может искажаться — это не влияет на данные).</w:t>
+      </w:r>
+    </w:p>
+    <w:p>
+      <w:pPr>
+        <w:keepLines/>
+        <w:spacing w:before="40" w:after="160" w:line="240" w:lineRule="auto"/>
+        <w:ind w:firstLine="0" w:left="454"/>
+        <w:shd w:val="clear" w:color="auto" w:fill="F2F2F2"/>
+      </w:pPr>
+      <w:r>
+        <w:rPr>
+          <w:rFonts w:ascii="Consolas" w:hAnsi="Consolas"/>
+          <w:b w:val="0"/>
+          <w:i w:val="0"/>
+          <w:sz w:val="21"/>
+        </w:rPr>
+        <w:t>M ≔ READBIN("prim.txt", "byte")</w:t>
+      </w:r>
+    </w:p>
+    <w:p>
+      <w:pPr>
+        <w:spacing w:before="120" w:after="160" w:line="240" w:lineRule="auto"/>
+        <w:ind w:firstLine="0"/>
+        <w:jc w:val="center"/>
+        <w:pBdr>
+          <w:top w:val="dashed" w:sz="8" w:space="6" w:color="808080"/>
+          <w:bottom w:val="dashed" w:sz="8" w:space="6" w:color="808080"/>
+          <w:left w:val="dashed" w:sz="8" w:space="6" w:color="808080"/>
+          <w:right w:val="dashed" w:sz="8" w:space="6" w:color="808080"/>
+        </w:pBdr>
+      </w:pPr>
+      <w:r>
+        <w:rPr>
+          <w:rFonts w:ascii="Times New Roman" w:hAnsi="Times New Roman"/>
+          <w:b w:val="0"/>
+          <w:i/>
+          <w:color w:val="808080"/>
+          <w:sz w:val="22"/>
+        </w:rPr>
+        <w:t>[Рисунок 3 — скрин Mathcad: фрагмент вектора M (коды первых символов)]</w:t>
+      </w:r>
+    </w:p>
+    <w:p>
+      <w:pPr>
+        <w:spacing w:before="0" w:after="200" w:line="240" w:lineRule="auto"/>
+        <w:ind w:firstLine="0"/>
+        <w:jc w:val="center"/>
+      </w:pPr>
+      <w:r>
+        <w:rPr>
+          <w:rFonts w:ascii="Times New Roman" w:hAnsi="Times New Roman"/>
+          <w:b w:val="0"/>
+          <w:i/>
+          <w:sz w:val="24"/>
+        </w:rPr>
+        <w:t>Рисунок 3 — Фрагмент сообщения, подлежащего скрытию</w:t>
+      </w:r>
+    </w:p>
+    <w:p>
+      <w:pPr>
+        <w:keepNext/>
+        <w:spacing w:before="200" w:after="60" w:line="240" w:lineRule="auto"/>
+        <w:ind w:firstLine="0"/>
+        <w:jc w:val="left"/>
+      </w:pPr>
+      <w:r>
+        <w:rPr>
+          <w:rFonts w:ascii="Times New Roman" w:hAnsi="Times New Roman"/>
+          <w:b/>
+          <w:i w:val="0"/>
+          <w:sz w:val="26"/>
+        </w:rPr>
+        <w:t>Шаг 3. Криптографическое кодирование (модифицированный Виженер)</w:t>
+      </w:r>
+    </w:p>
+    <w:p>
+      <w:pPr>
+        <w:spacing w:after="80" w:line="360" w:lineRule="auto"/>
+        <w:ind w:firstLine="709"/>
+        <w:jc w:val="both"/>
+      </w:pPr>
+      <w:r>
+        <w:rPr>
+          <w:rFonts w:ascii="Times New Roman" w:hAnsi="Times New Roman"/>
+          <w:b w:val="0"/>
+          <w:i w:val="0"/>
+          <w:sz w:val="28"/>
+        </w:rPr>
+        <w:t>Алфавит источника задаётся ASCII-кодами (Na = 256). Из символов алфавита задаётся секретный ключ K, длина которого Nk определяется функцией strlen, а объём сообщения Nm — функцией rows. Модуль M.1 расширяет ключ на длину сообщения, циклически повторяя его символы. Модуль M.2 выполняет шифрование: к коду каждого символа прибавляется соответствующий символ расширенного ключа по модулю Na.</w:t>
+      </w:r>
+    </w:p>
+    <w:p>
+      <w:pPr>
+        <w:keepLines/>
+        <w:spacing w:before="40" w:after="160" w:line="240" w:lineRule="auto"/>
+        <w:ind w:firstLine="0" w:left="454"/>
+        <w:shd w:val="clear" w:color="auto" w:fill="F2F2F2"/>
+      </w:pPr>
+      <w:r>
+        <w:rPr>
+          <w:rFonts w:ascii="Consolas" w:hAnsi="Consolas"/>
+          <w:b w:val="0"/>
+          <w:i w:val="0"/>
+          <w:sz w:val="21"/>
+        </w:rPr>
+        <w:t>Na ≔ 256</w:t>
+        <w:br/>
+      </w:r>
+      <w:r>
+        <w:rPr>
+          <w:rFonts w:ascii="Consolas" w:hAnsi="Consolas"/>
+          <w:b w:val="0"/>
+          <w:i w:val="0"/>
+          <w:sz w:val="21"/>
+        </w:rPr>
+        <w:t>K ≔ "@JeKc-I980"</w:t>
+        <w:br/>
+      </w:r>
+      <w:r>
+        <w:rPr>
+          <w:rFonts w:ascii="Consolas" w:hAnsi="Consolas"/>
+          <w:b w:val="0"/>
+          <w:i w:val="0"/>
+          <w:sz w:val="21"/>
+        </w:rPr>
+        <w:t>Nk ≔ strlen(K)</w:t>
+        <w:br/>
+      </w:r>
+      <w:r>
+        <w:rPr>
+          <w:rFonts w:ascii="Consolas" w:hAnsi="Consolas"/>
+          <w:b w:val="0"/>
+          <w:i w:val="0"/>
+          <w:sz w:val="21"/>
+        </w:rPr>
+        <w:t>Nm ≔ rows(M)</w:t>
+      </w:r>
+    </w:p>
+    <w:p>
+      <w:pPr>
+        <w:keepNext/>
+        <w:spacing w:before="120" w:after="40"/>
+        <w:ind w:firstLine="0"/>
+        <w:jc w:val="center"/>
+      </w:pPr>
+      <w:r>
+        <w:rPr>
+          <w:rFonts w:ascii="Times New Roman" w:hAnsi="Times New Roman"/>
+          <w:b w:val="0"/>
+          <w:i/>
+          <w:sz w:val="24"/>
+        </w:rPr>
+        <w:t>Модуль M.1 — расширение ключа на длину сообщения</w:t>
+      </w:r>
+    </w:p>
+    <w:p>
+      <w:pPr>
+        <w:keepLines/>
+        <w:spacing w:before="40" w:after="160" w:line="240" w:lineRule="auto"/>
+        <w:ind w:firstLine="0" w:left="454"/>
+        <w:shd w:val="clear" w:color="auto" w:fill="F2F2F2"/>
+      </w:pPr>
+      <w:r>
+        <w:rPr>
+          <w:rFonts w:ascii="Consolas" w:hAnsi="Consolas"/>
+          <w:b w:val="0"/>
+          <w:i w:val="0"/>
+          <w:sz w:val="21"/>
+        </w:rPr>
+        <w:t>K1 ≔  K ← str2vec(K)</w:t>
+        <w:br/>
+      </w:r>
+      <w:r>
+        <w:rPr>
+          <w:rFonts w:ascii="Consolas" w:hAnsi="Consolas"/>
+          <w:b w:val="0"/>
+          <w:i w:val="0"/>
+          <w:sz w:val="21"/>
+        </w:rPr>
+        <w:t xml:space="preserve">      for i ∈ 0 .. Nm − 1</w:t>
+        <w:br/>
+      </w:r>
+      <w:r>
+        <w:rPr>
+          <w:rFonts w:ascii="Consolas" w:hAnsi="Consolas"/>
+          <w:b w:val="0"/>
+          <w:i w:val="0"/>
+          <w:sz w:val="21"/>
+        </w:rPr>
+        <w:t xml:space="preserve">         r ← mod(i, Nk)</w:t>
+        <w:br/>
+      </w:r>
+      <w:r>
+        <w:rPr>
+          <w:rFonts w:ascii="Consolas" w:hAnsi="Consolas"/>
+          <w:b w:val="0"/>
+          <w:i w:val="0"/>
+          <w:sz w:val="21"/>
+        </w:rPr>
+        <w:t xml:space="preserve">         K1_i ← K_r</w:t>
+        <w:br/>
+      </w:r>
+      <w:r>
+        <w:rPr>
+          <w:rFonts w:ascii="Consolas" w:hAnsi="Consolas"/>
+          <w:b w:val="0"/>
+          <w:i w:val="0"/>
+          <w:sz w:val="21"/>
+        </w:rPr>
+        <w:t xml:space="preserve">      K1</w:t>
+      </w:r>
+    </w:p>
+    <w:p>
+      <w:pPr>
+        <w:keepNext/>
+        <w:spacing w:before="120" w:after="40"/>
+        <w:ind w:firstLine="0"/>
+        <w:jc w:val="center"/>
+      </w:pPr>
+      <w:r>
+        <w:rPr>
+          <w:rFonts w:ascii="Times New Roman" w:hAnsi="Times New Roman"/>
+          <w:b w:val="0"/>
+          <w:i/>
+          <w:sz w:val="24"/>
+        </w:rPr>
+        <w:t>Модуль M.2 — шифрование сообщения</w:t>
+      </w:r>
+    </w:p>
+    <w:p>
+      <w:pPr>
+        <w:keepLines/>
+        <w:spacing w:before="40" w:after="160" w:line="240" w:lineRule="auto"/>
+        <w:ind w:firstLine="0" w:left="454"/>
+        <w:shd w:val="clear" w:color="auto" w:fill="F2F2F2"/>
+      </w:pPr>
+      <w:r>
+        <w:rPr>
+          <w:rFonts w:ascii="Consolas" w:hAnsi="Consolas"/>
+          <w:b w:val="0"/>
+          <w:i w:val="0"/>
+          <w:sz w:val="21"/>
+        </w:rPr>
+        <w:t>M_cod ≔  for j ∈ 0 .. Nm − 1</w:t>
+        <w:br/>
+      </w:r>
+      <w:r>
+        <w:rPr>
+          <w:rFonts w:ascii="Consolas" w:hAnsi="Consolas"/>
+          <w:b w:val="0"/>
+          <w:i w:val="0"/>
+          <w:sz w:val="21"/>
+        </w:rPr>
+        <w:t xml:space="preserve">            M_cod_j ← mod(M_j + K1_j, Na)</w:t>
+        <w:br/>
+      </w:r>
+      <w:r>
+        <w:rPr>
+          <w:rFonts w:ascii="Consolas" w:hAnsi="Consolas"/>
+          <w:b w:val="0"/>
+          <w:i w:val="0"/>
+          <w:sz w:val="21"/>
+        </w:rPr>
+        <w:t xml:space="preserve">         M_cod</w:t>
+      </w:r>
+    </w:p>
+    <w:p>
+      <w:pPr>
+        <w:keepNext/>
+        <w:spacing w:before="200" w:after="60" w:line="240" w:lineRule="auto"/>
+        <w:ind w:firstLine="0"/>
+        <w:jc w:val="left"/>
+      </w:pPr>
+      <w:r>
+        <w:rPr>
+          <w:rFonts w:ascii="Times New Roman" w:hAnsi="Times New Roman"/>
+          <w:b/>
+          <w:i w:val="0"/>
+          <w:sz w:val="26"/>
+        </w:rPr>
+        <w:t>Шаг 4. Обрамление шифротекста метками начала и конца</w:t>
+      </w:r>
+    </w:p>
+    <w:p>
+      <w:pPr>
+        <w:spacing w:after="80" w:line="360" w:lineRule="auto"/>
+        <w:ind w:firstLine="709"/>
+        <w:jc w:val="both"/>
+      </w:pPr>
+      <w:r>
+        <w:rPr>
+          <w:rFonts w:ascii="Times New Roman" w:hAnsi="Times New Roman"/>
+          <w:b w:val="0"/>
+          <w:i w:val="0"/>
+          <w:sz w:val="28"/>
+        </w:rPr>
+        <w:t>Чтобы при распаковке чётко определить границы полезной нагрузки, вводятся секретные метки. Их коды разнесены по ASCII-оси (латиница, цифры, спецсимволы), чтобы снизить вероятность их случайного появления и обнаружения при стегоанализе. Метки добавляются к шифротексту функцией stack, для чего строки предварительно переводятся в векторы ASCII-кодов функцией str2vec.</w:t>
+      </w:r>
+    </w:p>
+    <w:p>
+      <w:pPr>
+        <w:keepLines/>
+        <w:spacing w:before="40" w:after="160" w:line="240" w:lineRule="auto"/>
+        <w:ind w:firstLine="0" w:left="454"/>
+        <w:shd w:val="clear" w:color="auto" w:fill="F2F2F2"/>
+      </w:pPr>
+      <w:r>
+        <w:rPr>
+          <w:rFonts w:ascii="Consolas" w:hAnsi="Consolas"/>
+          <w:b w:val="0"/>
+          <w:i w:val="0"/>
+          <w:sz w:val="21"/>
+        </w:rPr>
+        <w:t>m_start ≔ "n0G@m0k"</w:t>
+        <w:br/>
+      </w:r>
+      <w:r>
+        <w:rPr>
+          <w:rFonts w:ascii="Consolas" w:hAnsi="Consolas"/>
+          <w:b w:val="0"/>
+          <w:i w:val="0"/>
+          <w:sz w:val="21"/>
+        </w:rPr>
+        <w:t>m_end   ≔ "KiHeu,6"</w:t>
+        <w:br/>
+      </w:r>
+      <w:r>
+        <w:rPr>
+          <w:rFonts w:ascii="Consolas" w:hAnsi="Consolas"/>
+          <w:b w:val="0"/>
+          <w:i w:val="0"/>
+          <w:sz w:val="21"/>
+        </w:rPr>
+        <w:t>sMe ≔ stack(str2vec(m_start), M_cod, str2vec(m_end))</w:t>
+      </w:r>
+    </w:p>
+    <w:p>
+      <w:pPr>
+        <w:spacing w:after="80" w:line="360" w:lineRule="auto"/>
+        <w:ind w:firstLine="709"/>
+        <w:jc w:val="both"/>
+      </w:pPr>
+      <w:r>
+        <w:rPr>
+          <w:rFonts w:ascii="Times New Roman" w:hAnsi="Times New Roman"/>
+          <w:b w:val="0"/>
+          <w:i w:val="0"/>
+          <w:sz w:val="28"/>
+        </w:rPr>
+        <w:t>Число НЗБ, необходимое для встраивания, равно 8·rows(sMe); ёмкость контейнера равна 3·rows(C)·cols(C). Сравнение этих величин подтверждает, что контейнер имеет достаточный объём.</w:t>
+      </w:r>
+    </w:p>
+    <w:p>
+      <w:pPr>
+        <w:keepNext/>
+        <w:spacing w:before="200" w:after="60" w:line="240" w:lineRule="auto"/>
+        <w:ind w:firstLine="0"/>
+        <w:jc w:val="left"/>
+      </w:pPr>
+      <w:r>
+        <w:rPr>
+          <w:rFonts w:ascii="Times New Roman" w:hAnsi="Times New Roman"/>
+          <w:b/>
+          <w:i w:val="0"/>
+          <w:sz w:val="26"/>
+        </w:rPr>
+        <w:t>Шаг 5. Функции перевода десятичное ↔ двоичное</w:t>
+      </w:r>
+    </w:p>
+    <w:p>
+      <w:pPr>
+        <w:spacing w:after="80" w:line="360" w:lineRule="auto"/>
+        <w:ind w:firstLine="709"/>
+        <w:jc w:val="both"/>
+      </w:pPr>
+      <w:r>
+        <w:rPr>
+          <w:rFonts w:ascii="Times New Roman" w:hAnsi="Times New Roman"/>
+          <w:b w:val="0"/>
+          <w:i w:val="0"/>
+          <w:sz w:val="28"/>
+        </w:rPr>
+        <w:t>Поскольку встроенных функций перевода систем счисления в Mathcad нет, они создаются модулями. Модуль M.3 (B2D) переводит двоичное число, заданное вектором-столбцом (первый элемент — младший разряд), в десятичное. Модуль M.4 (D2B) выполняет обратное преобразование.</w:t>
+      </w:r>
+    </w:p>
+    <w:p>
+      <w:pPr>
+        <w:keepNext/>
+        <w:spacing w:before="120" w:after="40"/>
+        <w:ind w:firstLine="0"/>
+        <w:jc w:val="center"/>
+      </w:pPr>
+      <w:r>
+        <w:rPr>
+          <w:rFonts w:ascii="Times New Roman" w:hAnsi="Times New Roman"/>
+          <w:b w:val="0"/>
+          <w:i/>
+          <w:sz w:val="24"/>
+        </w:rPr>
+        <w:t>Модуль M.3 — двоичное → десятичное</w:t>
+      </w:r>
+    </w:p>
+    <w:p>
+      <w:pPr>
+        <w:keepLines/>
+        <w:spacing w:before="40" w:after="160" w:line="240" w:lineRule="auto"/>
+        <w:ind w:firstLine="0" w:left="454"/>
+        <w:shd w:val="clear" w:color="auto" w:fill="F2F2F2"/>
+      </w:pPr>
+      <w:r>
+        <w:rPr>
+          <w:rFonts w:ascii="Consolas" w:hAnsi="Consolas"/>
+          <w:b w:val="0"/>
+          <w:i w:val="0"/>
+          <w:sz w:val="21"/>
+        </w:rPr>
+        <w:t>B2D(x) ≔  Σ (i = 0 .. 7)  x_i · 2^i</w:t>
+      </w:r>
+    </w:p>
+    <w:p>
+      <w:pPr>
+        <w:keepNext/>
+        <w:spacing w:before="120" w:after="40"/>
+        <w:ind w:firstLine="0"/>
+        <w:jc w:val="center"/>
+      </w:pPr>
+      <w:r>
+        <w:rPr>
+          <w:rFonts w:ascii="Times New Roman" w:hAnsi="Times New Roman"/>
+          <w:b w:val="0"/>
+          <w:i/>
+          <w:sz w:val="24"/>
+        </w:rPr>
+        <w:t>Модуль M.4 — десятичное → двоичное</w:t>
+      </w:r>
+    </w:p>
+    <w:p>
+      <w:pPr>
+        <w:keepLines/>
+        <w:spacing w:before="40" w:after="160" w:line="240" w:lineRule="auto"/>
+        <w:ind w:firstLine="0" w:left="454"/>
+        <w:shd w:val="clear" w:color="auto" w:fill="F2F2F2"/>
+      </w:pPr>
+      <w:r>
+        <w:rPr>
+          <w:rFonts w:ascii="Consolas" w:hAnsi="Consolas"/>
+          <w:b w:val="0"/>
+          <w:i w:val="0"/>
+          <w:sz w:val="21"/>
+        </w:rPr>
+        <w:t>D2B(x) ≔  for i ∈ 0 .. 7</w:t>
+        <w:br/>
+      </w:r>
+      <w:r>
+        <w:rPr>
+          <w:rFonts w:ascii="Consolas" w:hAnsi="Consolas"/>
+          <w:b w:val="0"/>
+          <w:i w:val="0"/>
+          <w:sz w:val="21"/>
+        </w:rPr>
+        <w:t xml:space="preserve">             V_i ← mod(x, 2)</w:t>
+        <w:br/>
+      </w:r>
+      <w:r>
+        <w:rPr>
+          <w:rFonts w:ascii="Consolas" w:hAnsi="Consolas"/>
+          <w:b w:val="0"/>
+          <w:i w:val="0"/>
+          <w:sz w:val="21"/>
+        </w:rPr>
+        <w:t xml:space="preserve">             x   ← floor(x / 2)</w:t>
+        <w:br/>
+      </w:r>
+      <w:r>
+        <w:rPr>
+          <w:rFonts w:ascii="Consolas" w:hAnsi="Consolas"/>
+          <w:b w:val="0"/>
+          <w:i w:val="0"/>
+          <w:sz w:val="21"/>
+        </w:rPr>
+        <w:t xml:space="preserve">          V</w:t>
+      </w:r>
+    </w:p>
+    <w:p>
+      <w:pPr>
+        <w:keepNext/>
+        <w:spacing w:before="200" w:after="60" w:line="240" w:lineRule="auto"/>
+        <w:ind w:firstLine="0"/>
+        <w:jc w:val="left"/>
+      </w:pPr>
+      <w:r>
+        <w:rPr>
+          <w:rFonts w:ascii="Times New Roman" w:hAnsi="Times New Roman"/>
+          <w:b/>
+          <w:i w:val="0"/>
+          <w:sz w:val="26"/>
+        </w:rPr>
+        <w:t>Шаг 6. Развёртка контейнера в вектор</w:t>
+      </w:r>
+    </w:p>
+    <w:p>
+      <w:pPr>
+        <w:spacing w:after="80" w:line="360" w:lineRule="auto"/>
+        <w:ind w:firstLine="709"/>
+        <w:jc w:val="both"/>
+      </w:pPr>
+      <w:r>
+        <w:rPr>
+          <w:rFonts w:ascii="Times New Roman" w:hAnsi="Times New Roman"/>
+          <w:b w:val="0"/>
+          <w:i w:val="0"/>
+          <w:sz w:val="28"/>
+        </w:rPr>
+        <w:t>Для удобства дальнейшей обработки матрица C разворачивается в один вектор Cv. При этом порядок цветовых матриц временно меняется с R-G-B на B-G-R, что повышает защищённость скрытой информации. Объединение каналов выполняется функцией augment, а последовательная склейка столбцов — функцией stack (операция C^&lt;i&gt; выбирает i-й столбец).</w:t>
+      </w:r>
+    </w:p>
+    <w:p>
+      <w:pPr>
+        <w:keepNext/>
+        <w:spacing w:before="120" w:after="40"/>
+        <w:ind w:firstLine="0"/>
+        <w:jc w:val="center"/>
+      </w:pPr>
+      <w:r>
+        <w:rPr>
+          <w:rFonts w:ascii="Times New Roman" w:hAnsi="Times New Roman"/>
+          <w:b w:val="0"/>
+          <w:i/>
+          <w:sz w:val="24"/>
+        </w:rPr>
+        <w:t>Модуль M.5 — развёртка матрицы каналов в вектор (B-G-R)</w:t>
+      </w:r>
+    </w:p>
+    <w:p>
+      <w:pPr>
+        <w:keepLines/>
+        <w:spacing w:before="40" w:after="160" w:line="240" w:lineRule="auto"/>
+        <w:ind w:firstLine="0" w:left="454"/>
+        <w:shd w:val="clear" w:color="auto" w:fill="F2F2F2"/>
+      </w:pPr>
+      <w:r>
+        <w:rPr>
+          <w:rFonts w:ascii="Consolas" w:hAnsi="Consolas"/>
+          <w:b w:val="0"/>
+          <w:i w:val="0"/>
+          <w:sz w:val="21"/>
+        </w:rPr>
+        <w:t>Cv ≔  C1 ← augment(B, G, R)</w:t>
+        <w:br/>
+      </w:r>
+      <w:r>
+        <w:rPr>
+          <w:rFonts w:ascii="Consolas" w:hAnsi="Consolas"/>
+          <w:b w:val="0"/>
+          <w:i w:val="0"/>
+          <w:sz w:val="21"/>
+        </w:rPr>
+        <w:t xml:space="preserve">      Cv ← C1^&lt;0&gt;</w:t>
+        <w:br/>
+      </w:r>
+      <w:r>
+        <w:rPr>
+          <w:rFonts w:ascii="Consolas" w:hAnsi="Consolas"/>
+          <w:b w:val="0"/>
+          <w:i w:val="0"/>
+          <w:sz w:val="21"/>
+        </w:rPr>
+        <w:t xml:space="preserve">      for i ∈ 1 .. cols(C1) − 1</w:t>
+        <w:br/>
+      </w:r>
+      <w:r>
+        <w:rPr>
+          <w:rFonts w:ascii="Consolas" w:hAnsi="Consolas"/>
+          <w:b w:val="0"/>
+          <w:i w:val="0"/>
+          <w:sz w:val="21"/>
+        </w:rPr>
+        <w:t xml:space="preserve">         Cv ← stack(Cv, C1^&lt;i&gt;)</w:t>
+        <w:br/>
+      </w:r>
+      <w:r>
+        <w:rPr>
+          <w:rFonts w:ascii="Consolas" w:hAnsi="Consolas"/>
+          <w:b w:val="0"/>
+          <w:i w:val="0"/>
+          <w:sz w:val="21"/>
+        </w:rPr>
+        <w:t xml:space="preserve">      Cv</w:t>
+      </w:r>
+    </w:p>
+    <w:p>
+      <w:pPr>
+        <w:keepNext/>
+        <w:spacing w:before="200" w:after="60" w:line="240" w:lineRule="auto"/>
+        <w:ind w:firstLine="0"/>
+        <w:jc w:val="left"/>
+      </w:pPr>
+      <w:r>
+        <w:rPr>
+          <w:rFonts w:ascii="Times New Roman" w:hAnsi="Times New Roman"/>
+          <w:b/>
+          <w:i w:val="0"/>
+          <w:sz w:val="26"/>
+        </w:rPr>
+        <w:t>Шаг 7. Встраивание битов сообщения в младшие разряды</w:t>
+      </w:r>
+    </w:p>
+    <w:p>
+      <w:pPr>
+        <w:spacing w:after="80" w:line="360" w:lineRule="auto"/>
+        <w:ind w:firstLine="709"/>
+        <w:jc w:val="both"/>
+      </w:pPr>
+      <w:r>
+        <w:rPr>
+          <w:rFonts w:ascii="Times New Roman" w:hAnsi="Times New Roman"/>
+          <w:b w:val="0"/>
+          <w:i w:val="0"/>
+          <w:sz w:val="28"/>
+        </w:rPr>
+        <w:t>На основе вектора Cv формируется вектор Sv со скрытым сообщением. Каждый символ сообщения переводится в двоичный формат (b); каждый из восьми его разрядов записывается вместо младшего бита очередного элемента Cv (элемент также переводится в двоичный формат P, у него меняется P₀ — младший бит, — после чего число возвращается в десятичный формат). После обработки последнего символа оставшиеся элементы получают в младший бит случайное значение (round(rnd(1))) — это маскирует границу встроенных данных.</w:t>
+      </w:r>
+    </w:p>
+    <w:p>
+      <w:pPr>
+        <w:keepNext/>
+        <w:spacing w:before="120" w:after="40"/>
+        <w:ind w:firstLine="0"/>
+        <w:jc w:val="center"/>
+      </w:pPr>
+      <w:r>
+        <w:rPr>
+          <w:rFonts w:ascii="Times New Roman" w:hAnsi="Times New Roman"/>
+          <w:b w:val="0"/>
+          <w:i/>
+          <w:sz w:val="24"/>
+        </w:rPr>
+        <w:t>Модуль M.6 — встраивание битов в НЗБ контейнера</w:t>
+      </w:r>
+    </w:p>
+    <w:p>
+      <w:pPr>
+        <w:keepLines/>
+        <w:spacing w:before="40" w:after="160" w:line="240" w:lineRule="auto"/>
+        <w:ind w:firstLine="0" w:left="454"/>
+        <w:shd w:val="clear" w:color="auto" w:fill="F2F2F2"/>
+      </w:pPr>
+      <w:r>
+        <w:rPr>
+          <w:rFonts w:ascii="Consolas" w:hAnsi="Consolas"/>
+          <w:b w:val="0"/>
+          <w:i w:val="0"/>
+          <w:sz w:val="21"/>
+        </w:rPr>
+        <w:t>Sv ≔  for m ∈ 0 .. rows(sMe) − 1</w:t>
+        <w:br/>
+      </w:r>
+      <w:r>
+        <w:rPr>
+          <w:rFonts w:ascii="Consolas" w:hAnsi="Consolas"/>
+          <w:b w:val="0"/>
+          <w:i w:val="0"/>
+          <w:sz w:val="21"/>
+        </w:rPr>
+        <w:t xml:space="preserve">         b ← D2B(sMe_m)</w:t>
+        <w:br/>
+      </w:r>
+      <w:r>
+        <w:rPr>
+          <w:rFonts w:ascii="Consolas" w:hAnsi="Consolas"/>
+          <w:b w:val="0"/>
+          <w:i w:val="0"/>
+          <w:sz w:val="21"/>
+        </w:rPr>
+        <w:t xml:space="preserve">         for i ∈ 0 .. 7</w:t>
+        <w:br/>
+      </w:r>
+      <w:r>
+        <w:rPr>
+          <w:rFonts w:ascii="Consolas" w:hAnsi="Consolas"/>
+          <w:b w:val="0"/>
+          <w:i w:val="0"/>
+          <w:sz w:val="21"/>
+        </w:rPr>
+        <w:t xml:space="preserve">            P ← D2B(Cv_(i+8·m))</w:t>
+        <w:br/>
+      </w:r>
+      <w:r>
+        <w:rPr>
+          <w:rFonts w:ascii="Consolas" w:hAnsi="Consolas"/>
+          <w:b w:val="0"/>
+          <w:i w:val="0"/>
+          <w:sz w:val="21"/>
+        </w:rPr>
+        <w:t xml:space="preserve">            P_0 ← b_i</w:t>
+        <w:br/>
+      </w:r>
+      <w:r>
+        <w:rPr>
+          <w:rFonts w:ascii="Consolas" w:hAnsi="Consolas"/>
+          <w:b w:val="0"/>
+          <w:i w:val="0"/>
+          <w:sz w:val="21"/>
+        </w:rPr>
+        <w:t xml:space="preserve">            Sv_(i+8·m) ← B2D(P)</w:t>
+        <w:br/>
+      </w:r>
+      <w:r>
+        <w:rPr>
+          <w:rFonts w:ascii="Consolas" w:hAnsi="Consolas"/>
+          <w:b w:val="0"/>
+          <w:i w:val="0"/>
+          <w:sz w:val="21"/>
+        </w:rPr>
+        <w:t xml:space="preserve">      for j ∈ rows(Sv) .. rows(Cv) − 1</w:t>
+        <w:br/>
+      </w:r>
+      <w:r>
+        <w:rPr>
+          <w:rFonts w:ascii="Consolas" w:hAnsi="Consolas"/>
+          <w:b w:val="0"/>
+          <w:i w:val="0"/>
+          <w:sz w:val="21"/>
+        </w:rPr>
+        <w:t xml:space="preserve">         P ← D2B(Cv_j)</w:t>
+        <w:br/>
+      </w:r>
+      <w:r>
+        <w:rPr>
+          <w:rFonts w:ascii="Consolas" w:hAnsi="Consolas"/>
+          <w:b w:val="0"/>
+          <w:i w:val="0"/>
+          <w:sz w:val="21"/>
+        </w:rPr>
+        <w:t xml:space="preserve">         P_0 ← round(rnd(1))</w:t>
+        <w:br/>
+      </w:r>
+      <w:r>
+        <w:rPr>
+          <w:rFonts w:ascii="Consolas" w:hAnsi="Consolas"/>
+          <w:b w:val="0"/>
+          <w:i w:val="0"/>
+          <w:sz w:val="21"/>
+        </w:rPr>
+        <w:t xml:space="preserve">         Sv_j ← B2D(P)</w:t>
+        <w:br/>
+      </w:r>
+      <w:r>
+        <w:rPr>
+          <w:rFonts w:ascii="Consolas" w:hAnsi="Consolas"/>
+          <w:b w:val="0"/>
+          <w:i w:val="0"/>
+          <w:sz w:val="21"/>
+        </w:rPr>
+        <w:t xml:space="preserve">      Sv</w:t>
+      </w:r>
+    </w:p>
+    <w:p>
+      <w:pPr>
+        <w:keepNext/>
+        <w:spacing w:before="200" w:after="60" w:line="240" w:lineRule="auto"/>
+        <w:ind w:firstLine="0"/>
+        <w:jc w:val="left"/>
+      </w:pPr>
+      <w:r>
+        <w:rPr>
+          <w:rFonts w:ascii="Times New Roman" w:hAnsi="Times New Roman"/>
+          <w:b/>
+          <w:i w:val="0"/>
+          <w:sz w:val="26"/>
+        </w:rPr>
+        <w:t>Шаг 8. Свёртка вектора обратно в матрицу</w:t>
+      </w:r>
+    </w:p>
+    <w:p>
+      <w:pPr>
+        <w:spacing w:after="80" w:line="360" w:lineRule="auto"/>
+        <w:ind w:firstLine="709"/>
+        <w:jc w:val="both"/>
+      </w:pPr>
+      <w:r>
+        <w:rPr>
+          <w:rFonts w:ascii="Times New Roman" w:hAnsi="Times New Roman"/>
+          <w:b w:val="0"/>
+          <w:i w:val="0"/>
+          <w:sz w:val="28"/>
+        </w:rPr>
+        <w:t>Полученный вектор Sv сворачивается в матрицу S1 размерности исходной матрицы C. Функция submatrix(A, x, X, y, Y) возвращает часть матрицы A из строк x…X и столбцов y…Y.</w:t>
+      </w:r>
+    </w:p>
+    <w:p>
+      <w:pPr>
+        <w:keepNext/>
+        <w:spacing w:before="120" w:after="40"/>
+        <w:ind w:firstLine="0"/>
+        <w:jc w:val="center"/>
+      </w:pPr>
+      <w:r>
+        <w:rPr>
+          <w:rFonts w:ascii="Times New Roman" w:hAnsi="Times New Roman"/>
+          <w:b w:val="0"/>
+          <w:i/>
+          <w:sz w:val="24"/>
+        </w:rPr>
+        <w:t>Модуль M.7 — свёртка вектора в матрицу</w:t>
+      </w:r>
+    </w:p>
+    <w:p>
+      <w:pPr>
+        <w:keepLines/>
+        <w:spacing w:before="40" w:after="160" w:line="240" w:lineRule="auto"/>
+        <w:ind w:firstLine="0" w:left="454"/>
+        <w:shd w:val="clear" w:color="auto" w:fill="F2F2F2"/>
+      </w:pPr>
+      <w:r>
+        <w:rPr>
+          <w:rFonts w:ascii="Consolas" w:hAnsi="Consolas"/>
+          <w:b w:val="0"/>
+          <w:i w:val="0"/>
+          <w:sz w:val="21"/>
+        </w:rPr>
+        <w:t>S1 ≔  for i ∈ 0 .. cols(C) − 1</w:t>
+        <w:br/>
+      </w:r>
+      <w:r>
+        <w:rPr>
+          <w:rFonts w:ascii="Consolas" w:hAnsi="Consolas"/>
+          <w:b w:val="0"/>
+          <w:i w:val="0"/>
+          <w:sz w:val="21"/>
+        </w:rPr>
+        <w:t xml:space="preserve">         S1^&lt;i&gt; ← submatrix(Sv, i·rows(C), (i+1)·rows(C) − 1, 0, 0)</w:t>
+        <w:br/>
+      </w:r>
+      <w:r>
+        <w:rPr>
+          <w:rFonts w:ascii="Consolas" w:hAnsi="Consolas"/>
+          <w:b w:val="0"/>
+          <w:i w:val="0"/>
+          <w:sz w:val="21"/>
+        </w:rPr>
+        <w:t xml:space="preserve">      S1</w:t>
+      </w:r>
+    </w:p>
+    <w:p>
+      <w:pPr>
+        <w:keepNext/>
+        <w:spacing w:before="200" w:after="60" w:line="240" w:lineRule="auto"/>
+        <w:ind w:firstLine="0"/>
+        <w:jc w:val="left"/>
+      </w:pPr>
+      <w:r>
+        <w:rPr>
+          <w:rFonts w:ascii="Times New Roman" w:hAnsi="Times New Roman"/>
+          <w:b/>
+          <w:i w:val="0"/>
+          <w:sz w:val="26"/>
+        </w:rPr>
+        <w:t>Шаг 9. Восстановление порядка каналов и запись результата</w:t>
+      </w:r>
+    </w:p>
+    <w:p>
+      <w:pPr>
+        <w:spacing w:after="80" w:line="360" w:lineRule="auto"/>
+        <w:ind w:firstLine="709"/>
+        <w:jc w:val="both"/>
+      </w:pPr>
+      <w:r>
+        <w:rPr>
+          <w:rFonts w:ascii="Times New Roman" w:hAnsi="Times New Roman"/>
+          <w:b w:val="0"/>
+          <w:i w:val="0"/>
+          <w:sz w:val="28"/>
+        </w:rPr>
+        <w:t>Из матрицы S1 выделяются цветовые подматрицы, которым возвращается прямой порядок R-G-B (модуль M.8). Полученная матрица S записывается в BMP-файл функцией WRITERGB. Объём файла-результата совпадает с объёмом оригинала.</w:t>
+      </w:r>
+    </w:p>
+    <w:p>
+      <w:pPr>
+        <w:keepNext/>
+        <w:spacing w:before="120" w:after="40"/>
+        <w:ind w:firstLine="0"/>
+        <w:jc w:val="center"/>
+      </w:pPr>
+      <w:r>
+        <w:rPr>
+          <w:rFonts w:ascii="Times New Roman" w:hAnsi="Times New Roman"/>
+          <w:b w:val="0"/>
+          <w:i/>
+          <w:sz w:val="24"/>
+        </w:rPr>
+        <w:t>Модуль M.8 — восстановление порядка каналов + запись файла</w:t>
+      </w:r>
+    </w:p>
+    <w:p>
+      <w:pPr>
+        <w:keepLines/>
+        <w:spacing w:before="40" w:after="160" w:line="240" w:lineRule="auto"/>
+        <w:ind w:firstLine="0" w:left="454"/>
+        <w:shd w:val="clear" w:color="auto" w:fill="F2F2F2"/>
+      </w:pPr>
+      <w:r>
+        <w:rPr>
+          <w:rFonts w:ascii="Consolas" w:hAnsi="Consolas"/>
+          <w:b w:val="0"/>
+          <w:i w:val="0"/>
+          <w:sz w:val="21"/>
+        </w:rPr>
+        <w:t>B_M ≔ submatrix(S1, 0, rows(C) − 1, 0,           cols(C)/3 − 1)</w:t>
+        <w:br/>
+      </w:r>
+      <w:r>
+        <w:rPr>
+          <w:rFonts w:ascii="Consolas" w:hAnsi="Consolas"/>
+          <w:b w:val="0"/>
+          <w:i w:val="0"/>
+          <w:sz w:val="21"/>
+        </w:rPr>
+        <w:t>G_M ≔ submatrix(S1, 0, rows(C) − 1, cols(C)/3,   2·cols(C)/3 − 1)</w:t>
+        <w:br/>
+      </w:r>
+      <w:r>
+        <w:rPr>
+          <w:rFonts w:ascii="Consolas" w:hAnsi="Consolas"/>
+          <w:b w:val="0"/>
+          <w:i w:val="0"/>
+          <w:sz w:val="21"/>
+        </w:rPr>
+        <w:t>R_M ≔ submatrix(S1, 0, rows(C) − 1, 2·cols(C)/3, cols(C) − 1)</w:t>
+        <w:br/>
+      </w:r>
+      <w:r>
+        <w:rPr>
+          <w:rFonts w:ascii="Consolas" w:hAnsi="Consolas"/>
+          <w:b w:val="0"/>
+          <w:i w:val="0"/>
+          <w:sz w:val="21"/>
+        </w:rPr>
+        <w:t>S ≔ augment(R_M, G_M, B_M)</w:t>
+        <w:br/>
+      </w:r>
+      <w:r>
+        <w:rPr>
+          <w:rFonts w:ascii="Consolas" w:hAnsi="Consolas"/>
+          <w:b w:val="0"/>
+          <w:i w:val="0"/>
+          <w:sz w:val="21"/>
+        </w:rPr>
+        <w:br/>
+      </w:r>
+      <w:r>
+        <w:rPr>
+          <w:rFonts w:ascii="Consolas" w:hAnsi="Consolas"/>
+          <w:b w:val="0"/>
+          <w:i w:val="0"/>
+          <w:sz w:val="21"/>
+        </w:rPr>
+        <w:t>WRITERGB("container1.bmp") ≔ S</w:t>
+      </w:r>
+    </w:p>
+    <w:p>
+      <w:pPr>
+        <w:spacing w:before="120" w:after="160" w:line="240" w:lineRule="auto"/>
+        <w:ind w:firstLine="0"/>
+        <w:jc w:val="center"/>
+        <w:pBdr>
+          <w:top w:val="dashed" w:sz="8" w:space="6" w:color="808080"/>
+          <w:bottom w:val="dashed" w:sz="8" w:space="6" w:color="808080"/>
+          <w:left w:val="dashed" w:sz="8" w:space="6" w:color="808080"/>
+          <w:right w:val="dashed" w:sz="8" w:space="6" w:color="808080"/>
+        </w:pBdr>
+      </w:pPr>
+      <w:r>
+        <w:rPr>
+          <w:rFonts w:ascii="Times New Roman" w:hAnsi="Times New Roman"/>
+          <w:b w:val="0"/>
+          <w:i/>
+          <w:color w:val="808080"/>
+          <w:sz w:val="22"/>
+        </w:rPr>
+        <w:t>[Рисунок 4 — скрин Mathcad: контейнер-результат S рядом с исходным]</w:t>
+      </w:r>
+    </w:p>
+    <w:p>
+      <w:pPr>
+        <w:spacing w:before="0" w:after="200" w:line="240" w:lineRule="auto"/>
+        <w:ind w:firstLine="0"/>
+        <w:jc w:val="center"/>
+      </w:pPr>
+      <w:r>
+        <w:rPr>
+          <w:rFonts w:ascii="Times New Roman" w:hAnsi="Times New Roman"/>
+          <w:b w:val="0"/>
+          <w:i/>
+          <w:sz w:val="24"/>
+        </w:rPr>
+        <w:t>Рисунок 4 — Контейнер-результат и его цветовые компоненты (визуальных отклонений от оригинала нет)</w:t>
+      </w:r>
+    </w:p>
+    <w:p>
+      <w:pPr>
+        <w:keepNext/>
+        <w:spacing w:before="200" w:after="60" w:line="240" w:lineRule="auto"/>
+        <w:ind w:firstLine="0"/>
+        <w:jc w:val="left"/>
+      </w:pPr>
+      <w:r>
+        <w:rPr>
+          <w:rFonts w:ascii="Times New Roman" w:hAnsi="Times New Roman"/>
+          <w:b/>
+          <w:i w:val="0"/>
+          <w:sz w:val="26"/>
+        </w:rPr>
+        <w:t>Шаг 10. Влияние номера разряда на скрытность</w:t>
+      </w:r>
+    </w:p>
+    <w:p>
+      <w:pPr>
+        <w:spacing w:after="80" w:line="360" w:lineRule="auto"/>
+        <w:ind w:firstLine="709"/>
+        <w:jc w:val="both"/>
+      </w:pPr>
+      <w:r>
+        <w:rPr>
+          <w:rFonts w:ascii="Times New Roman" w:hAnsi="Times New Roman"/>
+          <w:b w:val="0"/>
+          <w:i w:val="0"/>
+          <w:sz w:val="28"/>
+        </w:rPr>
+        <w:t>Если в модуле M.6 вместо младшего бита (индекс 0) использовать более старший разряд, искажения становятся заметнее: при внесении данных в 7-й (старший) бит изображение визуально разрушается. Визуально незаметно использование только младшего и, с оговорками, следующего за ним бита — последнее позволяет вдвое увеличить ёмкость контейнера ценой снижения скрытности.</w:t>
+      </w:r>
+    </w:p>
+    <w:p>
+      <w:pPr>
+        <w:keepNext/>
+        <w:spacing w:before="200" w:after="60" w:line="240" w:lineRule="auto"/>
+        <w:ind w:firstLine="0"/>
+        <w:jc w:val="left"/>
+      </w:pPr>
+      <w:r>
+        <w:rPr>
+          <w:rFonts w:ascii="Times New Roman" w:hAnsi="Times New Roman"/>
+          <w:b/>
+          <w:i w:val="0"/>
+          <w:sz w:val="26"/>
+        </w:rPr>
+        <w:t>Шаг 11. Чтение stego-контейнера и развёртка (извлечение)</w:t>
+      </w:r>
+    </w:p>
+    <w:p>
+      <w:pPr>
+        <w:spacing w:after="80" w:line="360" w:lineRule="auto"/>
+        <w:ind w:firstLine="709"/>
+        <w:jc w:val="both"/>
+      </w:pPr>
+      <w:r>
+        <w:rPr>
+          <w:rFonts w:ascii="Times New Roman" w:hAnsi="Times New Roman"/>
+          <w:b w:val="0"/>
+          <w:i w:val="0"/>
+          <w:sz w:val="28"/>
+        </w:rPr>
+        <w:t>Процесс распаковки выполняется в отдельном документе, куда копируются модули M.3 и M.4. Цветовые характеристики stego-контейнера переводятся в матрицы (READ_RED/GREEN/BLUE), которые разворачиваются в вектор Sv1 аналогично модулю M.5.</w:t>
+      </w:r>
+    </w:p>
+    <w:p>
+      <w:pPr>
+        <w:keepLines/>
+        <w:spacing w:before="40" w:after="160" w:line="240" w:lineRule="auto"/>
+        <w:ind w:firstLine="0" w:left="454"/>
+        <w:shd w:val="clear" w:color="auto" w:fill="F2F2F2"/>
+      </w:pPr>
+      <w:r>
+        <w:rPr>
+          <w:rFonts w:ascii="Consolas" w:hAnsi="Consolas"/>
+          <w:b w:val="0"/>
+          <w:i w:val="0"/>
+          <w:sz w:val="21"/>
+        </w:rPr>
+        <w:t>R1 ≔ READ_RED("container1.bmp")</w:t>
+        <w:br/>
+      </w:r>
+      <w:r>
+        <w:rPr>
+          <w:rFonts w:ascii="Consolas" w:hAnsi="Consolas"/>
+          <w:b w:val="0"/>
+          <w:i w:val="0"/>
+          <w:sz w:val="21"/>
+        </w:rPr>
+        <w:t>G1 ≔ READ_GREEN("container1.bmp")</w:t>
+        <w:br/>
+      </w:r>
+      <w:r>
+        <w:rPr>
+          <w:rFonts w:ascii="Consolas" w:hAnsi="Consolas"/>
+          <w:b w:val="0"/>
+          <w:i w:val="0"/>
+          <w:sz w:val="21"/>
+        </w:rPr>
+        <w:t>B1 ≔ READ_BLUE("container1.bmp")</w:t>
+      </w:r>
+    </w:p>
+    <w:p>
+      <w:pPr>
+        <w:keepNext/>
+        <w:spacing w:before="120" w:after="40"/>
+        <w:ind w:firstLine="0"/>
+        <w:jc w:val="center"/>
+      </w:pPr>
+      <w:r>
+        <w:rPr>
+          <w:rFonts w:ascii="Times New Roman" w:hAnsi="Times New Roman"/>
+          <w:b w:val="0"/>
+          <w:i/>
+          <w:sz w:val="24"/>
+        </w:rPr>
+        <w:t>Модуль M.9 — развёртка каналов stego-контейнера в вектор</w:t>
+      </w:r>
+    </w:p>
+    <w:p>
+      <w:pPr>
+        <w:keepLines/>
+        <w:spacing w:before="40" w:after="160" w:line="240" w:lineRule="auto"/>
+        <w:ind w:firstLine="0" w:left="454"/>
+        <w:shd w:val="clear" w:color="auto" w:fill="F2F2F2"/>
+      </w:pPr>
+      <w:r>
+        <w:rPr>
+          <w:rFonts w:ascii="Consolas" w:hAnsi="Consolas"/>
+          <w:b w:val="0"/>
+          <w:i w:val="0"/>
+          <w:sz w:val="21"/>
+        </w:rPr>
+        <w:t>Sv1 ≔  S1 ← augment(B1, G1, R1)</w:t>
+        <w:br/>
+      </w:r>
+      <w:r>
+        <w:rPr>
+          <w:rFonts w:ascii="Consolas" w:hAnsi="Consolas"/>
+          <w:b w:val="0"/>
+          <w:i w:val="0"/>
+          <w:sz w:val="21"/>
+        </w:rPr>
+        <w:t xml:space="preserve">       Sv1 ← S1^&lt;0&gt;</w:t>
+        <w:br/>
+      </w:r>
+      <w:r>
+        <w:rPr>
+          <w:rFonts w:ascii="Consolas" w:hAnsi="Consolas"/>
+          <w:b w:val="0"/>
+          <w:i w:val="0"/>
+          <w:sz w:val="21"/>
+        </w:rPr>
+        <w:t xml:space="preserve">       for i ∈ 1 .. cols(S1) − 1</w:t>
+        <w:br/>
+      </w:r>
+      <w:r>
+        <w:rPr>
+          <w:rFonts w:ascii="Consolas" w:hAnsi="Consolas"/>
+          <w:b w:val="0"/>
+          <w:i w:val="0"/>
+          <w:sz w:val="21"/>
+        </w:rPr>
+        <w:t xml:space="preserve">          Sv1 ← stack(Sv1, S1^&lt;i&gt;)</w:t>
+        <w:br/>
+      </w:r>
+      <w:r>
+        <w:rPr>
+          <w:rFonts w:ascii="Consolas" w:hAnsi="Consolas"/>
+          <w:b w:val="0"/>
+          <w:i w:val="0"/>
+          <w:sz w:val="21"/>
+        </w:rPr>
+        <w:t xml:space="preserve">       Sv1</w:t>
+      </w:r>
+    </w:p>
+    <w:p>
+      <w:pPr>
+        <w:spacing w:after="80" w:line="360" w:lineRule="auto"/>
+        <w:ind w:firstLine="709"/>
+        <w:jc w:val="both"/>
+      </w:pPr>
+      <w:r>
+        <w:rPr>
+          <w:rFonts w:ascii="Times New Roman" w:hAnsi="Times New Roman"/>
+          <w:b w:val="0"/>
+          <w:i w:val="0"/>
+          <w:sz w:val="28"/>
+        </w:rPr>
+        <w:t>Обрабатывая каждые восемь элементов вектора Sv1, распаковываем квазисообщение (модуль M.10). Так как заранее неизвестно, какую часть вектора занимает полезная информация, обрабатываются все элементы. Служебным символам с кодами 0…31 прибавляется дробный коэффициент 32,5 — чтобы строковые функции могли их обработать и чтобы позже отличить их от «настоящих» значений.</w:t>
+      </w:r>
+    </w:p>
+    <w:p>
+      <w:pPr>
+        <w:keepNext/>
+        <w:spacing w:before="120" w:after="40"/>
+        <w:ind w:firstLine="0"/>
+        <w:jc w:val="center"/>
+      </w:pPr>
+      <w:r>
+        <w:rPr>
+          <w:rFonts w:ascii="Times New Roman" w:hAnsi="Times New Roman"/>
+          <w:b w:val="0"/>
+          <w:i/>
+          <w:sz w:val="24"/>
+        </w:rPr>
+        <w:t>Модуль M.10 — извлечение квазисообщения из НЗБ</w:t>
+      </w:r>
+    </w:p>
+    <w:p>
+      <w:pPr>
+        <w:keepLines/>
+        <w:spacing w:before="40" w:after="160" w:line="240" w:lineRule="auto"/>
+        <w:ind w:firstLine="0" w:left="454"/>
+        <w:shd w:val="clear" w:color="auto" w:fill="F2F2F2"/>
+      </w:pPr>
+      <w:r>
+        <w:rPr>
+          <w:rFonts w:ascii="Consolas" w:hAnsi="Consolas"/>
+          <w:b w:val="0"/>
+          <w:i w:val="0"/>
+          <w:sz w:val="21"/>
+        </w:rPr>
+        <w:t>Mf ≔  for m ∈ 0 .. rows(Sv1)/8 − 1</w:t>
+        <w:br/>
+      </w:r>
+      <w:r>
+        <w:rPr>
+          <w:rFonts w:ascii="Consolas" w:hAnsi="Consolas"/>
+          <w:b w:val="0"/>
+          <w:i w:val="0"/>
+          <w:sz w:val="21"/>
+        </w:rPr>
+        <w:t xml:space="preserve">         for i ∈ 0 .. 7</w:t>
+        <w:br/>
+      </w:r>
+      <w:r>
+        <w:rPr>
+          <w:rFonts w:ascii="Consolas" w:hAnsi="Consolas"/>
+          <w:b w:val="0"/>
+          <w:i w:val="0"/>
+          <w:sz w:val="21"/>
+        </w:rPr>
+        <w:t xml:space="preserve">            P ← D2B(Sv1_(i+8·m))</w:t>
+        <w:br/>
+      </w:r>
+      <w:r>
+        <w:rPr>
+          <w:rFonts w:ascii="Consolas" w:hAnsi="Consolas"/>
+          <w:b w:val="0"/>
+          <w:i w:val="0"/>
+          <w:sz w:val="21"/>
+        </w:rPr>
+        <w:t xml:space="preserve">            b_i ← P_0</w:t>
+        <w:br/>
+      </w:r>
+      <w:r>
+        <w:rPr>
+          <w:rFonts w:ascii="Consolas" w:hAnsi="Consolas"/>
+          <w:b w:val="0"/>
+          <w:i w:val="0"/>
+          <w:sz w:val="21"/>
+        </w:rPr>
+        <w:t xml:space="preserve">         Mf_m ← B2D(b)</w:t>
+        <w:br/>
+      </w:r>
+      <w:r>
+        <w:rPr>
+          <w:rFonts w:ascii="Consolas" w:hAnsi="Consolas"/>
+          <w:b w:val="0"/>
+          <w:i w:val="0"/>
+          <w:sz w:val="21"/>
+        </w:rPr>
+        <w:t xml:space="preserve">         Mf_m ← Mf_m + 32.5   if Mf_m &lt; 32</w:t>
+        <w:br/>
+      </w:r>
+      <w:r>
+        <w:rPr>
+          <w:rFonts w:ascii="Consolas" w:hAnsi="Consolas"/>
+          <w:b w:val="0"/>
+          <w:i w:val="0"/>
+          <w:sz w:val="21"/>
+        </w:rPr>
+        <w:t xml:space="preserve">      Mf</w:t>
+      </w:r>
+    </w:p>
+    <w:p>
+      <w:pPr>
+        <w:keepNext/>
+        <w:spacing w:before="200" w:after="60" w:line="240" w:lineRule="auto"/>
+        <w:ind w:firstLine="0"/>
+        <w:jc w:val="left"/>
+      </w:pPr>
+      <w:r>
+        <w:rPr>
+          <w:rFonts w:ascii="Times New Roman" w:hAnsi="Times New Roman"/>
+          <w:b/>
+          <w:i w:val="0"/>
+          <w:sz w:val="26"/>
+        </w:rPr>
+        <w:t>Шаг 12. Запоминание позиций «обесформаченных» символов</w:t>
+      </w:r>
+    </w:p>
+    <w:p>
+      <w:pPr>
+        <w:spacing w:after="80" w:line="360" w:lineRule="auto"/>
+        <w:ind w:firstLine="709"/>
+        <w:jc w:val="both"/>
+      </w:pPr>
+      <w:r>
+        <w:rPr>
+          <w:rFonts w:ascii="Times New Roman" w:hAnsi="Times New Roman"/>
+          <w:b w:val="0"/>
+          <w:i w:val="0"/>
+          <w:sz w:val="28"/>
+        </w:rPr>
+        <w:t>Модуль M.11 запоминает номера элементов вектора Mf, значения которых были принудительно изменены на дробные: в столбец s массива N заносятся номера элементов со значением s + 32,5 (бывшие коды 0…31).</w:t>
+      </w:r>
+    </w:p>
+    <w:p>
+      <w:pPr>
+        <w:keepNext/>
+        <w:spacing w:before="120" w:after="40"/>
+        <w:ind w:firstLine="0"/>
+        <w:jc w:val="center"/>
+      </w:pPr>
+      <w:r>
+        <w:rPr>
+          <w:rFonts w:ascii="Times New Roman" w:hAnsi="Times New Roman"/>
+          <w:b w:val="0"/>
+          <w:i/>
+          <w:sz w:val="24"/>
+        </w:rPr>
+        <w:t>Модуль M.11 — индексы принудительно изменённых элементов</w:t>
+      </w:r>
+    </w:p>
+    <w:p>
+      <w:pPr>
+        <w:keepLines/>
+        <w:spacing w:before="40" w:after="160" w:line="240" w:lineRule="auto"/>
+        <w:ind w:firstLine="0" w:left="454"/>
+        <w:shd w:val="clear" w:color="auto" w:fill="F2F2F2"/>
+      </w:pPr>
+      <w:r>
+        <w:rPr>
+          <w:rFonts w:ascii="Consolas" w:hAnsi="Consolas"/>
+          <w:b w:val="0"/>
+          <w:i w:val="0"/>
+          <w:sz w:val="21"/>
+        </w:rPr>
+        <w:t>N ≔  for s ∈ 0 .. 31</w:t>
+        <w:br/>
+      </w:r>
+      <w:r>
+        <w:rPr>
+          <w:rFonts w:ascii="Consolas" w:hAnsi="Consolas"/>
+          <w:b w:val="0"/>
+          <w:i w:val="0"/>
+          <w:sz w:val="21"/>
+        </w:rPr>
+        <w:t xml:space="preserve">        i ← 0</w:t>
+        <w:br/>
+      </w:r>
+      <w:r>
+        <w:rPr>
+          <w:rFonts w:ascii="Consolas" w:hAnsi="Consolas"/>
+          <w:b w:val="0"/>
+          <w:i w:val="0"/>
+          <w:sz w:val="21"/>
+        </w:rPr>
+        <w:t xml:space="preserve">        for m ∈ 0 .. rows(Mf) − 1</w:t>
+        <w:br/>
+      </w:r>
+      <w:r>
+        <w:rPr>
+          <w:rFonts w:ascii="Consolas" w:hAnsi="Consolas"/>
+          <w:b w:val="0"/>
+          <w:i w:val="0"/>
+          <w:sz w:val="21"/>
+        </w:rPr>
+        <w:t xml:space="preserve">           if Mf_m = s + 32.5</w:t>
+        <w:br/>
+      </w:r>
+      <w:r>
+        <w:rPr>
+          <w:rFonts w:ascii="Consolas" w:hAnsi="Consolas"/>
+          <w:b w:val="0"/>
+          <w:i w:val="0"/>
+          <w:sz w:val="21"/>
+        </w:rPr>
+        <w:t xml:space="preserve">              N_(i,s) ← m</w:t>
+        <w:br/>
+      </w:r>
+      <w:r>
+        <w:rPr>
+          <w:rFonts w:ascii="Consolas" w:hAnsi="Consolas"/>
+          <w:b w:val="0"/>
+          <w:i w:val="0"/>
+          <w:sz w:val="21"/>
+        </w:rPr>
+        <w:t xml:space="preserve">              i ← i + 1</w:t>
+        <w:br/>
+      </w:r>
+      <w:r>
+        <w:rPr>
+          <w:rFonts w:ascii="Consolas" w:hAnsi="Consolas"/>
+          <w:b w:val="0"/>
+          <w:i w:val="0"/>
+          <w:sz w:val="21"/>
+        </w:rPr>
+        <w:t xml:space="preserve">     N</w:t>
+      </w:r>
+    </w:p>
+    <w:p>
+      <w:pPr>
+        <w:keepNext/>
+        <w:spacing w:before="200" w:after="60" w:line="240" w:lineRule="auto"/>
+        <w:ind w:firstLine="0"/>
+        <w:jc w:val="left"/>
+      </w:pPr>
+      <w:r>
+        <w:rPr>
+          <w:rFonts w:ascii="Times New Roman" w:hAnsi="Times New Roman"/>
+          <w:b/>
+          <w:i w:val="0"/>
+          <w:sz w:val="26"/>
+        </w:rPr>
+        <w:t>Шаг 13. Выделение полезной нагрузки по меткам</w:t>
+      </w:r>
+    </w:p>
+    <w:p>
+      <w:pPr>
+        <w:spacing w:after="80" w:line="360" w:lineRule="auto"/>
+        <w:ind w:firstLine="709"/>
+        <w:jc w:val="both"/>
+      </w:pPr>
+      <w:r>
+        <w:rPr>
+          <w:rFonts w:ascii="Times New Roman" w:hAnsi="Times New Roman"/>
+          <w:b w:val="0"/>
+          <w:i w:val="0"/>
+          <w:sz w:val="28"/>
+        </w:rPr>
+        <w:t>Зная метки, ограничивающие полезную информацию, выделяем её из квазисообщения (модуль M.12). Вектор Mf переводится в строку функцией vec2str и последовательно просматривается функцией substr в поиске стартовой и конечной меток; затем выделенная подстрока переводится обратно в вектор ASCII-кодов, а принудительно изменённые элементы восстанавливаются по массиву N.</w:t>
+      </w:r>
+    </w:p>
+    <w:p>
+      <w:pPr>
+        <w:keepNext/>
+        <w:spacing w:before="120" w:after="40"/>
+        <w:ind w:firstLine="0"/>
+        <w:jc w:val="center"/>
+      </w:pPr>
+      <w:r>
+        <w:rPr>
+          <w:rFonts w:ascii="Times New Roman" w:hAnsi="Times New Roman"/>
+          <w:b w:val="0"/>
+          <w:i/>
+          <w:sz w:val="24"/>
+        </w:rPr>
+        <w:t>Модуль M.12 — выделение шифротекста по меткам</w:t>
+      </w:r>
+    </w:p>
+    <w:p>
+      <w:pPr>
+        <w:keepLines/>
+        <w:spacing w:before="40" w:after="160" w:line="240" w:lineRule="auto"/>
+        <w:ind w:firstLine="0" w:left="454"/>
+        <w:shd w:val="clear" w:color="auto" w:fill="F2F2F2"/>
+      </w:pPr>
+      <w:r>
+        <w:rPr>
+          <w:rFonts w:ascii="Consolas" w:hAnsi="Consolas"/>
+          <w:b w:val="0"/>
+          <w:i w:val="0"/>
+          <w:sz w:val="21"/>
+        </w:rPr>
+        <w:t>M_cod1 ≔  s ← 0     e ← 0</w:t>
+        <w:br/>
+      </w:r>
+      <w:r>
+        <w:rPr>
+          <w:rFonts w:ascii="Consolas" w:hAnsi="Consolas"/>
+          <w:b w:val="0"/>
+          <w:i w:val="0"/>
+          <w:sz w:val="21"/>
+        </w:rPr>
+        <w:t xml:space="preserve">          bs ← strlen(m1_start)     be ← strlen(m1_end)</w:t>
+        <w:br/>
+      </w:r>
+      <w:r>
+        <w:rPr>
+          <w:rFonts w:ascii="Consolas" w:hAnsi="Consolas"/>
+          <w:b w:val="0"/>
+          <w:i w:val="0"/>
+          <w:sz w:val="21"/>
+        </w:rPr>
+        <w:t xml:space="preserve">          Mf ← vec2str(Mf)</w:t>
+        <w:br/>
+      </w:r>
+      <w:r>
+        <w:rPr>
+          <w:rFonts w:ascii="Consolas" w:hAnsi="Consolas"/>
+          <w:b w:val="0"/>
+          <w:i w:val="0"/>
+          <w:sz w:val="21"/>
+        </w:rPr>
+        <w:t xml:space="preserve">          for m ∈ 0 .. strlen(Mf) − 1</w:t>
+        <w:br/>
+      </w:r>
+      <w:r>
+        <w:rPr>
+          <w:rFonts w:ascii="Consolas" w:hAnsi="Consolas"/>
+          <w:b w:val="0"/>
+          <w:i w:val="0"/>
+          <w:sz w:val="21"/>
+        </w:rPr>
+        <w:t xml:space="preserve">             s ← m + bs  if (substr(Mf,m,bs) = m1_start) ∧ (s = 0)</w:t>
+        <w:br/>
+      </w:r>
+      <w:r>
+        <w:rPr>
+          <w:rFonts w:ascii="Consolas" w:hAnsi="Consolas"/>
+          <w:b w:val="0"/>
+          <w:i w:val="0"/>
+          <w:sz w:val="21"/>
+        </w:rPr>
+        <w:t xml:space="preserve">             e ← m − 1   if (substr(Mf,m,be) = m1_end)   ∧ (e = 0)</w:t>
+        <w:br/>
+      </w:r>
+      <w:r>
+        <w:rPr>
+          <w:rFonts w:ascii="Consolas" w:hAnsi="Consolas"/>
+          <w:b w:val="0"/>
+          <w:i w:val="0"/>
+          <w:sz w:val="21"/>
+        </w:rPr>
+        <w:t xml:space="preserve">             break       if (s ≠ 0) ∧ (e ≠ 0)</w:t>
+        <w:br/>
+      </w:r>
+      <w:r>
+        <w:rPr>
+          <w:rFonts w:ascii="Consolas" w:hAnsi="Consolas"/>
+          <w:b w:val="0"/>
+          <w:i w:val="0"/>
+          <w:sz w:val="21"/>
+        </w:rPr>
+        <w:t xml:space="preserve">          Mf ← substr(Mf, s, e − s + 1)</w:t>
+        <w:br/>
+      </w:r>
+      <w:r>
+        <w:rPr>
+          <w:rFonts w:ascii="Consolas" w:hAnsi="Consolas"/>
+          <w:b w:val="0"/>
+          <w:i w:val="0"/>
+          <w:sz w:val="21"/>
+        </w:rPr>
+        <w:t xml:space="preserve">          M_cod1 ← str2vec(Mf)</w:t>
+        <w:br/>
+      </w:r>
+      <w:r>
+        <w:rPr>
+          <w:rFonts w:ascii="Consolas" w:hAnsi="Consolas"/>
+          <w:b w:val="0"/>
+          <w:i w:val="0"/>
+          <w:sz w:val="21"/>
+        </w:rPr>
+        <w:t xml:space="preserve">          for n ∈ 0 .. cols(N) − 1</w:t>
+        <w:br/>
+      </w:r>
+      <w:r>
+        <w:rPr>
+          <w:rFonts w:ascii="Consolas" w:hAnsi="Consolas"/>
+          <w:b w:val="0"/>
+          <w:i w:val="0"/>
+          <w:sz w:val="21"/>
+        </w:rPr>
+        <w:t xml:space="preserve">             for i ∈ 0 .. rows(N) − 1</w:t>
+        <w:br/>
+      </w:r>
+      <w:r>
+        <w:rPr>
+          <w:rFonts w:ascii="Consolas" w:hAnsi="Consolas"/>
+          <w:b w:val="0"/>
+          <w:i w:val="0"/>
+          <w:sz w:val="21"/>
+        </w:rPr>
+        <w:t xml:space="preserve">                break if (N_(i,n) = 0) ∨ (N_(i,n) &gt; e)</w:t>
+        <w:br/>
+      </w:r>
+      <w:r>
+        <w:rPr>
+          <w:rFonts w:ascii="Consolas" w:hAnsi="Consolas"/>
+          <w:b w:val="0"/>
+          <w:i w:val="0"/>
+          <w:sz w:val="21"/>
+        </w:rPr>
+        <w:t xml:space="preserve">                M_cod1_(N_(i,n)−bs) ← n  if s &lt; N_(i,n) ≤ e</w:t>
+        <w:br/>
+      </w:r>
+      <w:r>
+        <w:rPr>
+          <w:rFonts w:ascii="Consolas" w:hAnsi="Consolas"/>
+          <w:b w:val="0"/>
+          <w:i w:val="0"/>
+          <w:sz w:val="21"/>
+        </w:rPr>
+        <w:t xml:space="preserve">          M_cod1</w:t>
+      </w:r>
+    </w:p>
+    <w:p>
+      <w:pPr>
+        <w:keepNext/>
+        <w:spacing w:before="200" w:after="60" w:line="240" w:lineRule="auto"/>
+        <w:ind w:firstLine="0"/>
+        <w:jc w:val="left"/>
+      </w:pPr>
+      <w:r>
+        <w:rPr>
+          <w:rFonts w:ascii="Times New Roman" w:hAnsi="Times New Roman"/>
+          <w:b/>
+          <w:i w:val="0"/>
+          <w:sz w:val="26"/>
+        </w:rPr>
+        <w:t>Шаг 14. Расшифровка сообщения</w:t>
+      </w:r>
+    </w:p>
+    <w:p>
+      <w:pPr>
+        <w:spacing w:after="80" w:line="360" w:lineRule="auto"/>
+        <w:ind w:firstLine="709"/>
+        <w:jc w:val="both"/>
+      </w:pPr>
+      <w:r>
+        <w:rPr>
+          <w:rFonts w:ascii="Times New Roman" w:hAnsi="Times New Roman"/>
+          <w:b w:val="0"/>
+          <w:i w:val="0"/>
+          <w:sz w:val="28"/>
+        </w:rPr>
+        <w:t>Авторизованной стороне известны алфавит (Na = 256), секретный ключ K и объём сообщения Nm = rows(M_cod1). Модуль M.13 расширяет ключ на длину сообщения (аналогично M.1), модуль M.14 выполняет расшифровку — вычитание символов ключа по модулю Na. Результат записывается в файл функцией WRITEBIN.</w:t>
+      </w:r>
+    </w:p>
+    <w:p>
+      <w:pPr>
+        <w:keepNext/>
+        <w:spacing w:before="120" w:after="40"/>
+        <w:ind w:firstLine="0"/>
+        <w:jc w:val="center"/>
+      </w:pPr>
+      <w:r>
+        <w:rPr>
+          <w:rFonts w:ascii="Times New Roman" w:hAnsi="Times New Roman"/>
+          <w:b w:val="0"/>
+          <w:i/>
+          <w:sz w:val="24"/>
+        </w:rPr>
+        <w:t>Модуль M.13 — расширение ключа для расшифровки</w:t>
+      </w:r>
+    </w:p>
+    <w:p>
+      <w:pPr>
+        <w:keepLines/>
+        <w:spacing w:before="40" w:after="160" w:line="240" w:lineRule="auto"/>
+        <w:ind w:firstLine="0" w:left="454"/>
+        <w:shd w:val="clear" w:color="auto" w:fill="F2F2F2"/>
+      </w:pPr>
+      <w:r>
+        <w:rPr>
+          <w:rFonts w:ascii="Consolas" w:hAnsi="Consolas"/>
+          <w:b w:val="0"/>
+          <w:i w:val="0"/>
+          <w:sz w:val="21"/>
+        </w:rPr>
+        <w:t>K11 ≔  K ← str2vec(K)</w:t>
+        <w:br/>
+      </w:r>
+      <w:r>
+        <w:rPr>
+          <w:rFonts w:ascii="Consolas" w:hAnsi="Consolas"/>
+          <w:b w:val="0"/>
+          <w:i w:val="0"/>
+          <w:sz w:val="21"/>
+        </w:rPr>
+        <w:t xml:space="preserve">       for i ∈ 0 .. Nm − 1</w:t>
+        <w:br/>
+      </w:r>
+      <w:r>
+        <w:rPr>
+          <w:rFonts w:ascii="Consolas" w:hAnsi="Consolas"/>
+          <w:b w:val="0"/>
+          <w:i w:val="0"/>
+          <w:sz w:val="21"/>
+        </w:rPr>
+        <w:t xml:space="preserve">          r ← mod(i, Nk)</w:t>
+        <w:br/>
+      </w:r>
+      <w:r>
+        <w:rPr>
+          <w:rFonts w:ascii="Consolas" w:hAnsi="Consolas"/>
+          <w:b w:val="0"/>
+          <w:i w:val="0"/>
+          <w:sz w:val="21"/>
+        </w:rPr>
+        <w:t xml:space="preserve">          K1_i ← K_r</w:t>
+        <w:br/>
+      </w:r>
+      <w:r>
+        <w:rPr>
+          <w:rFonts w:ascii="Consolas" w:hAnsi="Consolas"/>
+          <w:b w:val="0"/>
+          <w:i w:val="0"/>
+          <w:sz w:val="21"/>
+        </w:rPr>
+        <w:t xml:space="preserve">       K11</w:t>
+      </w:r>
+    </w:p>
+    <w:p>
+      <w:pPr>
+        <w:keepNext/>
+        <w:spacing w:before="120" w:after="40"/>
+        <w:ind w:firstLine="0"/>
+        <w:jc w:val="center"/>
+      </w:pPr>
+      <w:r>
+        <w:rPr>
+          <w:rFonts w:ascii="Times New Roman" w:hAnsi="Times New Roman"/>
+          <w:b w:val="0"/>
+          <w:i/>
+          <w:sz w:val="24"/>
+        </w:rPr>
+        <w:t>Модуль M.14 — расшифровка и запись сообщения</w:t>
+      </w:r>
+    </w:p>
+    <w:p>
+      <w:pPr>
+        <w:keepLines/>
+        <w:spacing w:before="40" w:after="160" w:line="240" w:lineRule="auto"/>
+        <w:ind w:firstLine="0" w:left="454"/>
+        <w:shd w:val="clear" w:color="auto" w:fill="F2F2F2"/>
+      </w:pPr>
+      <w:r>
+        <w:rPr>
+          <w:rFonts w:ascii="Consolas" w:hAnsi="Consolas"/>
+          <w:b w:val="0"/>
+          <w:i w:val="0"/>
+          <w:sz w:val="21"/>
+        </w:rPr>
+        <w:t>M1 ≔  for j ∈ 0 .. Nm − 1</w:t>
+        <w:br/>
+      </w:r>
+      <w:r>
+        <w:rPr>
+          <w:rFonts w:ascii="Consolas" w:hAnsi="Consolas"/>
+          <w:b w:val="0"/>
+          <w:i w:val="0"/>
+          <w:sz w:val="21"/>
+        </w:rPr>
+        <w:t xml:space="preserve">         M_j ← mod(Na + M_cod1_j − K11_j, Na)</w:t>
+        <w:br/>
+      </w:r>
+      <w:r>
+        <w:rPr>
+          <w:rFonts w:ascii="Consolas" w:hAnsi="Consolas"/>
+          <w:b w:val="0"/>
+          <w:i w:val="0"/>
+          <w:sz w:val="21"/>
+        </w:rPr>
+        <w:t xml:space="preserve">      M</w:t>
+        <w:br/>
+      </w:r>
+      <w:r>
+        <w:rPr>
+          <w:rFonts w:ascii="Consolas" w:hAnsi="Consolas"/>
+          <w:b w:val="0"/>
+          <w:i w:val="0"/>
+          <w:sz w:val="21"/>
+        </w:rPr>
+        <w:br/>
+      </w:r>
+      <w:r>
+        <w:rPr>
+          <w:rFonts w:ascii="Consolas" w:hAnsi="Consolas"/>
+          <w:b w:val="0"/>
+          <w:i w:val="0"/>
+          <w:sz w:val="21"/>
+        </w:rPr>
+        <w:t>WRITEBIN("M_dec.txt", "byte", 0) ≔ M1</w:t>
+      </w:r>
+    </w:p>
+    <w:p>
+      <w:pPr>
+        <w:spacing w:before="120" w:after="160" w:line="240" w:lineRule="auto"/>
+        <w:ind w:firstLine="0"/>
+        <w:jc w:val="center"/>
+        <w:pBdr>
+          <w:top w:val="dashed" w:sz="8" w:space="6" w:color="808080"/>
+          <w:bottom w:val="dashed" w:sz="8" w:space="6" w:color="808080"/>
+          <w:left w:val="dashed" w:sz="8" w:space="6" w:color="808080"/>
+          <w:right w:val="dashed" w:sz="8" w:space="6" w:color="808080"/>
+        </w:pBdr>
+      </w:pPr>
+      <w:r>
+        <w:rPr>
+          <w:rFonts w:ascii="Times New Roman" w:hAnsi="Times New Roman"/>
+          <w:b w:val="0"/>
+          <w:i/>
+          <w:color w:val="808080"/>
+          <w:sz w:val="22"/>
+        </w:rPr>
+        <w:t>[Рисунок 5 — скрин Mathcad: восстановленный текст (M_dec.txt = prim.txt)]</w:t>
+      </w:r>
+    </w:p>
+    <w:p>
+      <w:pPr>
+        <w:spacing w:before="0" w:after="200" w:line="240" w:lineRule="auto"/>
+        <w:ind w:firstLine="0"/>
+        <w:jc w:val="center"/>
+      </w:pPr>
+      <w:r>
+        <w:rPr>
+          <w:rFonts w:ascii="Times New Roman" w:hAnsi="Times New Roman"/>
+          <w:b w:val="0"/>
+          <w:i/>
+          <w:sz w:val="24"/>
+        </w:rPr>
+        <w:t>Рисунок 5 — Восстановленное сообщение совпадает с исходным</w:t>
+      </w:r>
+    </w:p>
+    <w:p>
+      <w:pPr>
+        <w:keepNext/>
+        <w:spacing w:before="240" w:after="120" w:line="240" w:lineRule="auto"/>
+        <w:ind w:firstLine="0"/>
+        <w:jc w:val="left"/>
+      </w:pPr>
+      <w:r>
+        <w:rPr>
+          <w:rFonts w:ascii="Times New Roman" w:hAnsi="Times New Roman"/>
+          <w:b/>
+          <w:i w:val="0"/>
+          <w:sz w:val="30"/>
+        </w:rPr>
+        <w:t>6. Контрольные вопросы</w:t>
+      </w:r>
+    </w:p>
+    <w:p>
+      <w:pPr>
+        <w:keepNext/>
+        <w:spacing w:before="200" w:after="60" w:line="240" w:lineRule="auto"/>
+        <w:ind w:firstLine="0"/>
+        <w:jc w:val="left"/>
+      </w:pPr>
+      <w:r>
+        <w:rPr>
+          <w:rFonts w:ascii="Times New Roman" w:hAnsi="Times New Roman"/>
+          <w:b/>
+          <w:i w:val="0"/>
+          <w:sz w:val="26"/>
+        </w:rPr>
+        <w:t>1. Какова цель методов стеганографии?</w:t>
+      </w:r>
+    </w:p>
+    <w:p>
+      <w:pPr>
+        <w:spacing w:after="80" w:line="360" w:lineRule="auto"/>
+        <w:ind w:firstLine="709"/>
+        <w:jc w:val="both"/>
+      </w:pPr>
+      <w:r>
+        <w:rPr>
+          <w:rFonts w:ascii="Times New Roman" w:hAnsi="Times New Roman"/>
+          <w:b w:val="0"/>
+          <w:i w:val="0"/>
+          <w:sz w:val="28"/>
+        </w:rPr>
+        <w:t>Скрыть сам факт существования и передачи секретного сообщения. В отличие от криптографии, которая скрывает содержание сообщения (но не факт его наличия), стеганография прячет сообщение внутри безобидного на вид контейнера, так что посторонний не подозревает о самом канале связи.</w:t>
+      </w:r>
+    </w:p>
+    <w:p>
+      <w:pPr>
+        <w:keepNext/>
+        <w:spacing w:before="200" w:after="60" w:line="240" w:lineRule="auto"/>
+        <w:ind w:firstLine="0"/>
+        <w:jc w:val="left"/>
+      </w:pPr>
+      <w:r>
+        <w:rPr>
+          <w:rFonts w:ascii="Times New Roman" w:hAnsi="Times New Roman"/>
+          <w:b/>
+          <w:i w:val="0"/>
+          <w:sz w:val="26"/>
+        </w:rPr>
+        <w:t>2. Как выполняется сокрытие данных методом наименее значащего бита?</w:t>
+      </w:r>
+    </w:p>
+    <w:p>
+      <w:pPr>
+        <w:spacing w:after="80" w:line="360" w:lineRule="auto"/>
+        <w:ind w:firstLine="709"/>
+        <w:jc w:val="both"/>
+      </w:pPr>
+      <w:r>
+        <w:rPr>
+          <w:rFonts w:ascii="Times New Roman" w:hAnsi="Times New Roman"/>
+          <w:b w:val="0"/>
+          <w:i w:val="0"/>
+          <w:sz w:val="28"/>
+        </w:rPr>
+        <w:t>Бит сообщения записывается вместо младшего значащего бита байта, кодирующего интенсивность цветовой компоненты пикселя. Так как младший бит вносит наименьший вклад в значение цвета, его изменение визуально незаметно. Для 24-битного RGB-изображения можно скрыть до 3 бит на пиксель (по одному в каждый канал).</w:t>
+      </w:r>
+    </w:p>
+    <w:p>
+      <w:pPr>
+        <w:keepNext/>
+        <w:spacing w:before="200" w:after="60" w:line="240" w:lineRule="auto"/>
+        <w:ind w:firstLine="0"/>
+        <w:jc w:val="left"/>
+      </w:pPr>
+      <w:r>
+        <w:rPr>
+          <w:rFonts w:ascii="Times New Roman" w:hAnsi="Times New Roman"/>
+          <w:b/>
+          <w:i w:val="0"/>
+          <w:sz w:val="26"/>
+        </w:rPr>
+        <w:t>3. Как зависит визуальное качество контейнера от номера использованного бита?</w:t>
+      </w:r>
+    </w:p>
+    <w:p>
+      <w:pPr>
+        <w:spacing w:after="80" w:line="360" w:lineRule="auto"/>
+        <w:ind w:firstLine="709"/>
+        <w:jc w:val="both"/>
+      </w:pPr>
+      <w:r>
+        <w:rPr>
+          <w:rFonts w:ascii="Times New Roman" w:hAnsi="Times New Roman"/>
+          <w:b w:val="0"/>
+          <w:i w:val="0"/>
+          <w:sz w:val="28"/>
+        </w:rPr>
+        <w:t>Чем старше используемый разряд, тем сильнее искажается изображение. Внесение данных в 0-й (младший) бит незаметно; в 1-й бит — практически незаметно; при использовании старших разрядов (вплоть до 7-го) появляются явные искажения, и изображение визуально разрушается.</w:t>
+      </w:r>
+    </w:p>
+    <w:p>
+      <w:pPr>
+        <w:keepNext/>
+        <w:spacing w:before="200" w:after="60" w:line="240" w:lineRule="auto"/>
+        <w:ind w:firstLine="0"/>
+        <w:jc w:val="left"/>
+      </w:pPr>
+      <w:r>
+        <w:rPr>
+          <w:rFonts w:ascii="Times New Roman" w:hAnsi="Times New Roman"/>
+          <w:b/>
+          <w:i w:val="0"/>
+          <w:sz w:val="26"/>
+        </w:rPr>
+        <w:t>4. Какие данные можно скрыть методом НЗБ?</w:t>
+      </w:r>
+    </w:p>
+    <w:p>
+      <w:pPr>
+        <w:spacing w:after="80" w:line="360" w:lineRule="auto"/>
+        <w:ind w:firstLine="709"/>
+        <w:jc w:val="both"/>
+      </w:pPr>
+      <w:r>
+        <w:rPr>
+          <w:rFonts w:ascii="Times New Roman" w:hAnsi="Times New Roman"/>
+          <w:b w:val="0"/>
+          <w:i w:val="0"/>
+          <w:sz w:val="28"/>
+        </w:rPr>
+        <w:t>Файлы любого формата — текст, изображения, звук, произвольные двоичные данные. Единственное условие — достаточный объём контейнера: ориентировочное соотношение объёмов контейнера и сообщения для метода НЗБ составляет не менее 8:1.</w:t>
+      </w:r>
+    </w:p>
+    <w:p>
+      <w:pPr>
+        <w:keepNext/>
+        <w:spacing w:before="200" w:after="60" w:line="240" w:lineRule="auto"/>
+        <w:ind w:firstLine="0"/>
+        <w:jc w:val="left"/>
+      </w:pPr>
+      <w:r>
+        <w:rPr>
+          <w:rFonts w:ascii="Times New Roman" w:hAnsi="Times New Roman"/>
+          <w:b/>
+          <w:i w:val="0"/>
+          <w:sz w:val="26"/>
+        </w:rPr>
+        <w:t>5. Как определить максимальный объём данных для сокрытия по методу НЗБ?</w:t>
+      </w:r>
+    </w:p>
+    <w:p>
+      <w:pPr>
+        <w:spacing w:after="80" w:line="360" w:lineRule="auto"/>
+        <w:ind w:firstLine="709"/>
+        <w:jc w:val="both"/>
+      </w:pPr>
+      <w:r>
+        <w:rPr>
+          <w:rFonts w:ascii="Times New Roman" w:hAnsi="Times New Roman"/>
+          <w:b w:val="0"/>
+          <w:i w:val="0"/>
+          <w:sz w:val="28"/>
+        </w:rPr>
+        <w:t>Максимальная ёмкость равна числу используемых наименее значащих бит: для изображения шириной W и высотой H с c цветовыми компонентами и b битами, выделяемыми под сокрытие в каждой компоненте, ёмкость составляет b·c·W·H бит. Для 24-битного RGB (c = 3) при использовании одного младшего бита это 3·W·H бит, то есть 3·W·H/8 байт.</w:t>
+      </w:r>
+    </w:p>
+    <w:p>
+      <w:pPr>
+        <w:keepNext/>
+        <w:spacing w:before="200" w:after="60" w:line="240" w:lineRule="auto"/>
+        <w:ind w:firstLine="0"/>
+        <w:jc w:val="left"/>
+      </w:pPr>
+      <w:r>
+        <w:rPr>
+          <w:rFonts w:ascii="Times New Roman" w:hAnsi="Times New Roman"/>
+          <w:b/>
+          <w:i w:val="0"/>
+          <w:sz w:val="26"/>
+        </w:rPr>
+        <w:t>6. Как можно повысить скрытность данных в методе НЗБ?</w:t>
+      </w:r>
+    </w:p>
+    <w:p>
+      <w:pPr>
+        <w:spacing w:after="80" w:line="360" w:lineRule="auto"/>
+        <w:ind w:firstLine="709"/>
+        <w:jc w:val="both"/>
+      </w:pPr>
+      <w:r>
+        <w:rPr>
+          <w:rFonts w:ascii="Times New Roman" w:hAnsi="Times New Roman"/>
+          <w:b w:val="0"/>
+          <w:i w:val="0"/>
+          <w:sz w:val="28"/>
+        </w:rPr>
+        <w:t>Использовать «зашумлённые» контейнеры (фотографии, сканы); встраивать биты не подряд, а по псевдослучайному закону или в каждый второй/третий пиксель; предварительно шифровать сообщение; учитывать закон распределения младших битов при их модификации; применять помехоустойчивое кодирование для снижения чувствительности к искажениям.</w:t>
+      </w:r>
+    </w:p>
+    <w:p>
+      <w:pPr>
+        <w:keepNext/>
+        <w:spacing w:before="240" w:after="120" w:line="240" w:lineRule="auto"/>
+        <w:ind w:firstLine="0"/>
+        <w:jc w:val="left"/>
+      </w:pPr>
+      <w:r>
+        <w:rPr>
+          <w:rFonts w:ascii="Times New Roman" w:hAnsi="Times New Roman"/>
+          <w:b/>
+          <w:i w:val="0"/>
+          <w:sz w:val="30"/>
         </w:rPr>
         <w:t>7. Вывод</w:t>
       </w:r>
     </w:p>
     <w:p>
       <w:pPr>
+        <w:spacing w:after="80" w:line="360" w:lineRule="auto"/>
+        <w:ind w:firstLine="709"/>
         <w:jc w:val="both"/>
       </w:pPr>
       <w:r>
         <w:rPr>
           <w:rFonts w:ascii="Times New Roman" w:hAnsi="Times New Roman"/>
+          <w:b w:val="0"/>
+          <w:i w:val="0"/>
           <w:sz w:val="28"/>
         </w:rPr>
-        <w:t>В рамках практической работы реализован метод стеганографической защиты данных через встраивание шифротекста в младшие биты каналов BMP-изображения. Сообщение шифруется модифицированным Виженером (mod 256) и обрамляется метками; извлечение возможно только при наличии того же ключа. Поскольку изменение младших битов каналов визуально незаметно, контейнер сохраняет исходный вид. Полный цикл «зашифровать → встроить → извлечь → расшифровать» подтверждён программно: сообщение восстановлено без потерь.</w:t>
+        <w:t>В ходе практической работы в математическом пакете Mathcad Prime реализован метод замены наименее значащего бита для сокрытия текстового сообщения в 24-битном BMP-изображении. Сообщение предварительно шифруется модифицированным шифром Виженера по модулю 256 и обрамляется секретными метками начала и конца; встраивание выполняется в младшие биты цветовых каналов, а незадействованные младшие биты заполняются случайными значениями для маскировки границы данных. Поскольку изменение младших битов визуально незаметно, контейнер-результат неотличим от оригинала. Реализована и обратная операция — извлечение квазисообщения, выделение полезной нагрузки по меткам и расшифровка. Полный цикл «зашифровать → встроить → извлечь → расшифровать» подтверждает работоспособность метода: восстановленное сообщение совпадает с исходным.</w:t>
       </w:r>
     </w:p>
     <w:sectPr>

</xml_diff>